<commit_message>
LiveFX Business: Gründer Tuncay Sancak, Investor Relations Gönül Demet, Stand Oktober 2026, Pre-Seed 500.000 € mit Mittelverwendung (DE/TR/EN)
- Businesspläne, Pitch-Decks, Vision, Quellen, LinkedIn, Landingpage, README angepasst
- SOM im Pitch an den Businessplan angeglichen, tools/README dreisprachig

Co-Authored-By: Claude Opus 5.5 <noreply@anthropic.com>
Claude-Session: https://claude.ai/code/session_01STcnjfrFEd99DGQ7JM2gQ3
</commit_message>
<xml_diff>
--- a/live-fx/business/BUSINESSPLAN.docx
+++ b/live-fx/business/BUSINESSPLAN.docx
@@ -90,7 +90,7 @@
           <w:sz w:val="22"/>
           <w:szCs w:val="22"/>
         </w:rPr>
-        <w:t xml:space="preserve">Gründerin: [Name] · Kontakt: [E-Mail] · [Ort]</w:t>
+        <w:t xml:space="preserve">Gründer &amp; Erfinder, Geschäftsführer: Tuncay Sancak · Investor Relations: Gönül Demet · Kontakt: [E-Mail] · [Ort]</w:t>
       </w:r>
     </w:p>
     <w:p>
@@ -135,7 +135,7 @@
           <w:sz w:val="18"/>
           <w:szCs w:val="18"/>
         </w:rPr>
-        <w:t xml:space="preserve">Alle Marktzahlen stammen aus öffentlichen Sekundärquellen und werden als Spannen angegeben; Nachweise als [Quelle n] im Text, Liste im Anhang. Eigene Annahmen sind ausdrücklich als „Schätzung“ gekennzeichnet. Zahlen in [eckigen Klammern] ergänzt die Gründerin.</w:t>
+        <w:t xml:space="preserve">Alle Marktzahlen stammen aus öffentlichen Sekundärquellen und werden als Spannen angegeben; Nachweise als [Quelle n] im Text, Liste im Anhang. Eigene Annahmen sind ausdrücklich als „Schätzung“ gekennzeichnet. Zahlen in [eckigen Klammern] ergänzt der Gründer.</w:t>
       </w:r>
     </w:p>
     <w:p>
@@ -491,7 +491,7 @@
             <w:sz w:val="22"/>
             <w:szCs w:val="22"/>
           </w:rPr>
-          <w:t xml:space="preserve">	14</w:t>
+          <w:t xml:space="preserve">	16</w:t>
         </w:r>
       </w:hyperlink>
     </w:p>
@@ -519,7 +519,7 @@
             <w:sz w:val="22"/>
             <w:szCs w:val="22"/>
           </w:rPr>
-          <w:t xml:space="preserve">	15</w:t>
+          <w:t xml:space="preserve">	17</w:t>
         </w:r>
       </w:hyperlink>
     </w:p>
@@ -547,7 +547,7 @@
             <w:sz w:val="22"/>
             <w:szCs w:val="22"/>
           </w:rPr>
-          <w:t xml:space="preserve">	16</w:t>
+          <w:t xml:space="preserve">	18</w:t>
         </w:r>
       </w:hyperlink>
     </w:p>
@@ -575,7 +575,7 @@
             <w:sz w:val="22"/>
             <w:szCs w:val="22"/>
           </w:rPr>
-          <w:t xml:space="preserve">	18</w:t>
+          <w:t xml:space="preserve">	19</w:t>
         </w:r>
       </w:hyperlink>
     </w:p>
@@ -603,7 +603,7 @@
             <w:sz w:val="22"/>
             <w:szCs w:val="22"/>
           </w:rPr>
-          <w:t xml:space="preserve">	22</w:t>
+          <w:t xml:space="preserve">	23</w:t>
         </w:r>
       </w:hyperlink>
     </w:p>
@@ -915,7 +915,7 @@
                 <w:sz w:val="18"/>
                 <w:szCs w:val="18"/>
               </w:rPr>
-              <w:t xml:space="preserve">Version 2.0, funktionsfähig, 238 fertige Trigger in fünf Paketen, 13 Szenen, 38 Sounds, automatisierte Tests, im Einsatz in den eigenen Live-Streams der Gründerin.</w:t>
+              <w:t xml:space="preserve">Version 2.0, funktionsfähig, 238 fertige Trigger in fünf Paketen, 13 Szenen, 38 Sounds, automatisierte Tests, im Einsatz in den eigenen Live-Streams des Gründers.</w:t>
             </w:r>
           </w:p>
         </w:tc>
@@ -1204,10 +1204,20 @@
             <w:r>
               <w:rPr>
                 <w:rFonts w:ascii="Calibri" w:cs="Calibri" w:eastAsia="Calibri" w:hAnsi="Calibri"/>
-                <w:sz w:val="18"/>
-                <w:szCs w:val="18"/>
-              </w:rPr>
-              <w:t xml:space="preserve">Mobile-Entwickler:in, Plattform-Partnerschaften, Pilot-Partner; Seed-Finanzierung [250–350 T€] für 18–24 Monate (Schätzung) oder Bootstrapping mit langsamerem Wachstum.</w:t>
+                <w:b/>
+                <w:bCs/>
+                <w:sz w:val="18"/>
+                <w:szCs w:val="18"/>
+              </w:rPr>
+              <w:t xml:space="preserve">500.000 € Pre-Seed</w:t>
+            </w:r>
+            <w:r>
+              <w:rPr>
+                <w:rFonts w:ascii="Calibri" w:cs="Calibri" w:eastAsia="Calibri" w:hAnsi="Calibri"/>
+                <w:sz w:val="18"/>
+                <w:szCs w:val="18"/>
+              </w:rPr>
+              <w:t xml:space="preserve"> für LiveFX und alle Projekte (Produkt 2.0 und Vision-Linien A–D), Mittelverwendung über 24 Monate (Vorschlag – bitte bestätigen, Kapitel 11.6); dazu Mobile-Entwickler:in, Plattform-Partnerschaften, Pilot-Partner.</w:t>
             </w:r>
           </w:p>
         </w:tc>
@@ -1229,7 +1239,7 @@
           <w:sz w:val="21"/>
           <w:szCs w:val="21"/>
         </w:rPr>
-        <w:t xml:space="preserve">Ask: Pilot-Partnerschaft mit einer Plattform (TikTok LIVE Studio, Instagram Live Producer, YouTube Live) oder einem Creator-Tool-Anbieter – alternativ Übernahme von Technologie und Team.</w:t>
+        <w:t xml:space="preserve">Ask: 500.000 € Pre-Seed (Kapitel 11.6) und eine Pilot-Partnerschaft mit einer Plattform (TikTok LIVE Studio, Instagram Live Producer, YouTube Live) oder einem Creator-Tool-Anbieter – alternativ Übernahme von Technologie und Team.</w:t>
       </w:r>
     </w:p>
     <w:p>
@@ -5578,7 +5588,7 @@
           <w:sz w:val="21"/>
           <w:szCs w:val="21"/>
         </w:rPr>
-        <w:t xml:space="preserve"> (Türkei und Diaspora in Deutschland/Europa): größtes Paket, kaum Wettbewerb, ausgeprägte Meme-Kultur, und die Gründerin ist selbst Teil dieser Community.</w:t>
+        <w:t xml:space="preserve"> (Türkei und Diaspora in Deutschland/Europa): größtes Paket, kaum Wettbewerb, ausgeprägte Meme-Kultur, und der Gründer ist selbst Teil dieser Community.</w:t>
       </w:r>
     </w:p>
     <w:p>
@@ -11308,7 +11318,7 @@
           <w:sz w:val="21"/>
           <w:szCs w:val="21"/>
         </w:rPr>
-        <w:t xml:space="preserve"> Entwickelt und getestet in den eigenen Live-Streams der Gründerin (Ton-Check, Echo-Warnung, Safe-Zones kommen aus echten Problemen).</w:t>
+        <w:t xml:space="preserve"> Entwickelt und getestet in den eigenen Live-Streams des Gründers (Ton-Check, Echo-Warnung, Safe-Zones kommen aus echten Problemen).</w:t>
       </w:r>
     </w:p>
     <w:p>
@@ -12407,7 +12417,7 @@
           <w:sz w:val="21"/>
           <w:szCs w:val="21"/>
         </w:rPr>
-        <w:t xml:space="preserve"> Launch im türkischsprachigen Raum: eigene Streams der Gründerin als dauerhafter Showcase, 10–20 Creator-Botschafter:innen mit Zugang und Feedback-Schleife über die Lernfunktion, Discord/Telegram-Gruppe, wöchentliche Pack-Drops. Clips aus echten Streams („Das Meme kam, weil ich ‚yok artık‘ gesagt habe“) sind das Marketing – das Produkt ist sein eigener Werbeträger.</w:t>
+        <w:t xml:space="preserve"> Launch im türkischsprachigen Raum: eigene Streams des Gründers als dauerhafter Showcase, 10–20 Creator-Botschafter:innen mit Zugang und Feedback-Schleife über die Lernfunktion, Discord/Telegram-Gruppe, wöchentliche Pack-Drops. Clips aus echten Streams („Das Meme kam, weil ich ‚yok artık‘ gesagt habe“) sind das Marketing – das Produkt ist sein eigener Werbeträger.</w:t>
       </w:r>
     </w:p>
     <w:p>
@@ -12670,7 +12680,7 @@
                 <w:sz w:val="18"/>
                 <w:szCs w:val="18"/>
               </w:rPr>
-              <w:t xml:space="preserve">LiveFX in jedem Stream der Gründerin, Clips als Shorts/Reels</w:t>
+              <w:t xml:space="preserve">LiveFX in jedem Stream des Gründers, Clips als Shorts/Reels</w:t>
             </w:r>
           </w:p>
         </w:tc>
@@ -13273,7 +13283,7 @@
           <w:sz w:val="21"/>
           <w:szCs w:val="21"/>
         </w:rPr>
-        <w:t xml:space="preserve"> der Gründerin auf Basis der Annahmen unten; es gibt noch keine Umsätze. Jahr 1 beginnt mit dem Launch des Pro-Abos.</w:t>
+        <w:t xml:space="preserve"> des Gründers auf Basis der Annahmen unten; es gibt noch keine Umsätze. Jahr 1 beginnt mit dem Launch des Pro-Abos.</w:t>
       </w:r>
     </w:p>
     <w:p>
@@ -16736,10 +16746,10 @@
         </w:tblBorders>
       </w:tblPr>
       <w:tblGrid>
-        <w:gridCol w:w="6814"/>
-        <w:gridCol w:w="941"/>
-        <w:gridCol w:w="941"/>
-        <w:gridCol w:w="942"/>
+        <w:gridCol w:w="6808"/>
+        <w:gridCol w:w="943"/>
+        <w:gridCol w:w="943"/>
+        <w:gridCol w:w="944"/>
       </w:tblGrid>
       <w:tr>
         <w:trPr>
@@ -16748,7 +16758,7 @@
         </w:trPr>
         <w:tc>
           <w:tcPr>
-            <w:tcW w:type="dxa" w:w="6814"/>
+            <w:tcW w:type="dxa" w:w="6808"/>
             <w:tcBorders>
               <w:top w:val="single" w:color="C8C8D0" w:sz="4"/>
               <w:left w:val="single" w:color="C8C8D0" w:sz="4"/>
@@ -16784,7 +16794,7 @@
         </w:tc>
         <w:tc>
           <w:tcPr>
-            <w:tcW w:type="dxa" w:w="941"/>
+            <w:tcW w:type="dxa" w:w="943"/>
             <w:tcBorders>
               <w:top w:val="single" w:color="C8C8D0" w:sz="4"/>
               <w:left w:val="single" w:color="C8C8D0" w:sz="4"/>
@@ -16820,7 +16830,7 @@
         </w:tc>
         <w:tc>
           <w:tcPr>
-            <w:tcW w:type="dxa" w:w="941"/>
+            <w:tcW w:type="dxa" w:w="943"/>
             <w:tcBorders>
               <w:top w:val="single" w:color="C8C8D0" w:sz="4"/>
               <w:left w:val="single" w:color="C8C8D0" w:sz="4"/>
@@ -16856,7 +16866,7 @@
         </w:tc>
         <w:tc>
           <w:tcPr>
-            <w:tcW w:type="dxa" w:w="942"/>
+            <w:tcW w:type="dxa" w:w="944"/>
             <w:tcBorders>
               <w:top w:val="single" w:color="C8C8D0" w:sz="4"/>
               <w:left w:val="single" w:color="C8C8D0" w:sz="4"/>
@@ -16898,7 +16908,7 @@
         </w:trPr>
         <w:tc>
           <w:tcPr>
-            <w:tcW w:type="dxa" w:w="6814"/>
+            <w:tcW w:type="dxa" w:w="6808"/>
             <w:tcBorders>
               <w:top w:val="single" w:color="C8C8D0" w:sz="4"/>
               <w:left w:val="single" w:color="C8C8D0" w:sz="4"/>
@@ -16930,7 +16940,7 @@
         </w:tc>
         <w:tc>
           <w:tcPr>
-            <w:tcW w:type="dxa" w:w="941"/>
+            <w:tcW w:type="dxa" w:w="943"/>
             <w:tcBorders>
               <w:top w:val="single" w:color="C8C8D0" w:sz="4"/>
               <w:left w:val="single" w:color="C8C8D0" w:sz="4"/>
@@ -16962,7 +16972,7 @@
         </w:tc>
         <w:tc>
           <w:tcPr>
-            <w:tcW w:type="dxa" w:w="941"/>
+            <w:tcW w:type="dxa" w:w="943"/>
             <w:tcBorders>
               <w:top w:val="single" w:color="C8C8D0" w:sz="4"/>
               <w:left w:val="single" w:color="C8C8D0" w:sz="4"/>
@@ -16994,7 +17004,7 @@
         </w:tc>
         <w:tc>
           <w:tcPr>
-            <w:tcW w:type="dxa" w:w="942"/>
+            <w:tcW w:type="dxa" w:w="944"/>
             <w:tcBorders>
               <w:top w:val="single" w:color="C8C8D0" w:sz="4"/>
               <w:left w:val="single" w:color="C8C8D0" w:sz="4"/>
@@ -17032,7 +17042,7 @@
         </w:trPr>
         <w:tc>
           <w:tcPr>
-            <w:tcW w:type="dxa" w:w="6814"/>
+            <w:tcW w:type="dxa" w:w="6808"/>
             <w:tcBorders>
               <w:top w:val="single" w:color="C8C8D0" w:sz="4"/>
               <w:left w:val="single" w:color="C8C8D0" w:sz="4"/>
@@ -17065,7 +17075,7 @@
         </w:tc>
         <w:tc>
           <w:tcPr>
-            <w:tcW w:type="dxa" w:w="941"/>
+            <w:tcW w:type="dxa" w:w="943"/>
             <w:tcBorders>
               <w:top w:val="single" w:color="C8C8D0" w:sz="4"/>
               <w:left w:val="single" w:color="C8C8D0" w:sz="4"/>
@@ -17098,7 +17108,7 @@
         </w:tc>
         <w:tc>
           <w:tcPr>
-            <w:tcW w:type="dxa" w:w="941"/>
+            <w:tcW w:type="dxa" w:w="943"/>
             <w:tcBorders>
               <w:top w:val="single" w:color="C8C8D0" w:sz="4"/>
               <w:left w:val="single" w:color="C8C8D0" w:sz="4"/>
@@ -17131,7 +17141,7 @@
         </w:tc>
         <w:tc>
           <w:tcPr>
-            <w:tcW w:type="dxa" w:w="942"/>
+            <w:tcW w:type="dxa" w:w="944"/>
             <w:tcBorders>
               <w:top w:val="single" w:color="C8C8D0" w:sz="4"/>
               <w:left w:val="single" w:color="C8C8D0" w:sz="4"/>
@@ -17170,39 +17180,39 @@
         </w:trPr>
         <w:tc>
           <w:tcPr>
-            <w:tcW w:type="dxa" w:w="6814"/>
-            <w:tcBorders>
-              <w:top w:val="single" w:color="C8C8D0" w:sz="4"/>
-              <w:left w:val="single" w:color="C8C8D0" w:sz="4"/>
-              <w:bottom w:val="single" w:color="C8C8D0" w:sz="4"/>
-              <w:right w:val="single" w:color="C8C8D0" w:sz="4"/>
-            </w:tcBorders>
-            <w:tcMar>
-              <w:top w:type="dxa" w:w="50"/>
-              <w:left w:type="dxa" w:w="90"/>
-              <w:bottom w:type="dxa" w:w="50"/>
-              <w:right w:type="dxa" w:w="90"/>
-            </w:tcMar>
-            <w:vAlign w:val="center"/>
-          </w:tcPr>
-          <w:p>
-            <w:pPr>
-              <w:spacing w:after="20" w:before="20" w:line="252"/>
-              <w:jc w:val="left"/>
-            </w:pPr>
-            <w:r>
-              <w:rPr>
-                <w:rFonts w:ascii="Calibri" w:cs="Calibri" w:eastAsia="Calibri" w:hAnsi="Calibri"/>
-                <w:sz w:val="18"/>
-                <w:szCs w:val="18"/>
-              </w:rPr>
-              <w:t xml:space="preserve">Gründerin (Gehalt)</w:t>
-            </w:r>
-          </w:p>
-        </w:tc>
-        <w:tc>
-          <w:tcPr>
-            <w:tcW w:type="dxa" w:w="941"/>
+            <w:tcW w:type="dxa" w:w="6808"/>
+            <w:tcBorders>
+              <w:top w:val="single" w:color="C8C8D0" w:sz="4"/>
+              <w:left w:val="single" w:color="C8C8D0" w:sz="4"/>
+              <w:bottom w:val="single" w:color="C8C8D0" w:sz="4"/>
+              <w:right w:val="single" w:color="C8C8D0" w:sz="4"/>
+            </w:tcBorders>
+            <w:tcMar>
+              <w:top w:type="dxa" w:w="50"/>
+              <w:left w:type="dxa" w:w="90"/>
+              <w:bottom w:type="dxa" w:w="50"/>
+              <w:right w:type="dxa" w:w="90"/>
+            </w:tcMar>
+            <w:vAlign w:val="center"/>
+          </w:tcPr>
+          <w:p>
+            <w:pPr>
+              <w:spacing w:after="20" w:before="20" w:line="252"/>
+              <w:jc w:val="left"/>
+            </w:pPr>
+            <w:r>
+              <w:rPr>
+                <w:rFonts w:ascii="Calibri" w:cs="Calibri" w:eastAsia="Calibri" w:hAnsi="Calibri"/>
+                <w:sz w:val="18"/>
+                <w:szCs w:val="18"/>
+              </w:rPr>
+              <w:t xml:space="preserve">Gründer (Gehalt)</w:t>
+            </w:r>
+          </w:p>
+        </w:tc>
+        <w:tc>
+          <w:tcPr>
+            <w:tcW w:type="dxa" w:w="943"/>
             <w:tcBorders>
               <w:top w:val="single" w:color="C8C8D0" w:sz="4"/>
               <w:left w:val="single" w:color="C8C8D0" w:sz="4"/>
@@ -17234,7 +17244,7 @@
         </w:tc>
         <w:tc>
           <w:tcPr>
-            <w:tcW w:type="dxa" w:w="941"/>
+            <w:tcW w:type="dxa" w:w="943"/>
             <w:tcBorders>
               <w:top w:val="single" w:color="C8C8D0" w:sz="4"/>
               <w:left w:val="single" w:color="C8C8D0" w:sz="4"/>
@@ -17266,7 +17276,7 @@
         </w:tc>
         <w:tc>
           <w:tcPr>
-            <w:tcW w:type="dxa" w:w="942"/>
+            <w:tcW w:type="dxa" w:w="944"/>
             <w:tcBorders>
               <w:top w:val="single" w:color="C8C8D0" w:sz="4"/>
               <w:left w:val="single" w:color="C8C8D0" w:sz="4"/>
@@ -17304,7 +17314,7 @@
         </w:trPr>
         <w:tc>
           <w:tcPr>
-            <w:tcW w:type="dxa" w:w="6814"/>
+            <w:tcW w:type="dxa" w:w="6808"/>
             <w:tcBorders>
               <w:top w:val="single" w:color="C8C8D0" w:sz="4"/>
               <w:left w:val="single" w:color="C8C8D0" w:sz="4"/>
@@ -17337,7 +17347,7 @@
         </w:tc>
         <w:tc>
           <w:tcPr>
-            <w:tcW w:type="dxa" w:w="941"/>
+            <w:tcW w:type="dxa" w:w="943"/>
             <w:tcBorders>
               <w:top w:val="single" w:color="C8C8D0" w:sz="4"/>
               <w:left w:val="single" w:color="C8C8D0" w:sz="4"/>
@@ -17370,7 +17380,7 @@
         </w:tc>
         <w:tc>
           <w:tcPr>
-            <w:tcW w:type="dxa" w:w="941"/>
+            <w:tcW w:type="dxa" w:w="943"/>
             <w:tcBorders>
               <w:top w:val="single" w:color="C8C8D0" w:sz="4"/>
               <w:left w:val="single" w:color="C8C8D0" w:sz="4"/>
@@ -17403,7 +17413,7 @@
         </w:tc>
         <w:tc>
           <w:tcPr>
-            <w:tcW w:type="dxa" w:w="942"/>
+            <w:tcW w:type="dxa" w:w="944"/>
             <w:tcBorders>
               <w:top w:val="single" w:color="C8C8D0" w:sz="4"/>
               <w:left w:val="single" w:color="C8C8D0" w:sz="4"/>
@@ -17442,7 +17452,7 @@
         </w:trPr>
         <w:tc>
           <w:tcPr>
-            <w:tcW w:type="dxa" w:w="6814"/>
+            <w:tcW w:type="dxa" w:w="6808"/>
             <w:tcBorders>
               <w:top w:val="single" w:color="C8C8D0" w:sz="4"/>
               <w:left w:val="single" w:color="C8C8D0" w:sz="4"/>
@@ -17474,7 +17484,7 @@
         </w:tc>
         <w:tc>
           <w:tcPr>
-            <w:tcW w:type="dxa" w:w="941"/>
+            <w:tcW w:type="dxa" w:w="943"/>
             <w:tcBorders>
               <w:top w:val="single" w:color="C8C8D0" w:sz="4"/>
               <w:left w:val="single" w:color="C8C8D0" w:sz="4"/>
@@ -17506,7 +17516,7 @@
         </w:tc>
         <w:tc>
           <w:tcPr>
-            <w:tcW w:type="dxa" w:w="941"/>
+            <w:tcW w:type="dxa" w:w="943"/>
             <w:tcBorders>
               <w:top w:val="single" w:color="C8C8D0" w:sz="4"/>
               <w:left w:val="single" w:color="C8C8D0" w:sz="4"/>
@@ -17538,7 +17548,7 @@
         </w:tc>
         <w:tc>
           <w:tcPr>
-            <w:tcW w:type="dxa" w:w="942"/>
+            <w:tcW w:type="dxa" w:w="944"/>
             <w:tcBorders>
               <w:top w:val="single" w:color="C8C8D0" w:sz="4"/>
               <w:left w:val="single" w:color="C8C8D0" w:sz="4"/>
@@ -17576,7 +17586,7 @@
         </w:trPr>
         <w:tc>
           <w:tcPr>
-            <w:tcW w:type="dxa" w:w="6814"/>
+            <w:tcW w:type="dxa" w:w="6808"/>
             <w:tcBorders>
               <w:top w:val="single" w:color="C8C8D0" w:sz="4"/>
               <w:left w:val="single" w:color="C8C8D0" w:sz="4"/>
@@ -17609,7 +17619,7 @@
         </w:tc>
         <w:tc>
           <w:tcPr>
-            <w:tcW w:type="dxa" w:w="941"/>
+            <w:tcW w:type="dxa" w:w="943"/>
             <w:tcBorders>
               <w:top w:val="single" w:color="C8C8D0" w:sz="4"/>
               <w:left w:val="single" w:color="C8C8D0" w:sz="4"/>
@@ -17642,7 +17652,7 @@
         </w:tc>
         <w:tc>
           <w:tcPr>
-            <w:tcW w:type="dxa" w:w="941"/>
+            <w:tcW w:type="dxa" w:w="943"/>
             <w:tcBorders>
               <w:top w:val="single" w:color="C8C8D0" w:sz="4"/>
               <w:left w:val="single" w:color="C8C8D0" w:sz="4"/>
@@ -17675,7 +17685,7 @@
         </w:tc>
         <w:tc>
           <w:tcPr>
-            <w:tcW w:type="dxa" w:w="942"/>
+            <w:tcW w:type="dxa" w:w="944"/>
             <w:tcBorders>
               <w:top w:val="single" w:color="C8C8D0" w:sz="4"/>
               <w:left w:val="single" w:color="C8C8D0" w:sz="4"/>
@@ -17714,7 +17724,7 @@
         </w:trPr>
         <w:tc>
           <w:tcPr>
-            <w:tcW w:type="dxa" w:w="6814"/>
+            <w:tcW w:type="dxa" w:w="6808"/>
             <w:tcBorders>
               <w:top w:val="single" w:color="C8C8D0" w:sz="4"/>
               <w:left w:val="single" w:color="C8C8D0" w:sz="4"/>
@@ -17746,7 +17756,7 @@
         </w:tc>
         <w:tc>
           <w:tcPr>
-            <w:tcW w:type="dxa" w:w="941"/>
+            <w:tcW w:type="dxa" w:w="943"/>
             <w:tcBorders>
               <w:top w:val="single" w:color="C8C8D0" w:sz="4"/>
               <w:left w:val="single" w:color="C8C8D0" w:sz="4"/>
@@ -17778,7 +17788,7 @@
         </w:tc>
         <w:tc>
           <w:tcPr>
-            <w:tcW w:type="dxa" w:w="941"/>
+            <w:tcW w:type="dxa" w:w="943"/>
             <w:tcBorders>
               <w:top w:val="single" w:color="C8C8D0" w:sz="4"/>
               <w:left w:val="single" w:color="C8C8D0" w:sz="4"/>
@@ -17810,7 +17820,7 @@
         </w:tc>
         <w:tc>
           <w:tcPr>
-            <w:tcW w:type="dxa" w:w="942"/>
+            <w:tcW w:type="dxa" w:w="944"/>
             <w:tcBorders>
               <w:top w:val="single" w:color="C8C8D0" w:sz="4"/>
               <w:left w:val="single" w:color="C8C8D0" w:sz="4"/>
@@ -17848,7 +17858,7 @@
         </w:trPr>
         <w:tc>
           <w:tcPr>
-            <w:tcW w:type="dxa" w:w="6814"/>
+            <w:tcW w:type="dxa" w:w="6808"/>
             <w:tcBorders>
               <w:top w:val="single" w:color="C8C8D0" w:sz="4"/>
               <w:left w:val="single" w:color="C8C8D0" w:sz="4"/>
@@ -17883,7 +17893,7 @@
         </w:tc>
         <w:tc>
           <w:tcPr>
-            <w:tcW w:type="dxa" w:w="941"/>
+            <w:tcW w:type="dxa" w:w="943"/>
             <w:tcBorders>
               <w:top w:val="single" w:color="C8C8D0" w:sz="4"/>
               <w:left w:val="single" w:color="C8C8D0" w:sz="4"/>
@@ -17918,7 +17928,7 @@
         </w:tc>
         <w:tc>
           <w:tcPr>
-            <w:tcW w:type="dxa" w:w="941"/>
+            <w:tcW w:type="dxa" w:w="943"/>
             <w:tcBorders>
               <w:top w:val="single" w:color="C8C8D0" w:sz="4"/>
               <w:left w:val="single" w:color="C8C8D0" w:sz="4"/>
@@ -17953,7 +17963,7 @@
         </w:tc>
         <w:tc>
           <w:tcPr>
-            <w:tcW w:type="dxa" w:w="942"/>
+            <w:tcW w:type="dxa" w:w="944"/>
             <w:tcBorders>
               <w:top w:val="single" w:color="C8C8D0" w:sz="4"/>
               <w:left w:val="single" w:color="C8C8D0" w:sz="4"/>
@@ -18754,7 +18764,7 @@
           <w:sz w:val="21"/>
           <w:szCs w:val="21"/>
         </w:rPr>
-        <w:t xml:space="preserve">Finanzierungsbedarf (Schätzung):</w:t>
+        <w:t xml:space="preserve">Finanzierungsbedarf:</w:t>
       </w:r>
       <w:r>
         <w:rPr>
@@ -18762,7 +18772,7 @@
           <w:sz w:val="21"/>
           <w:szCs w:val="21"/>
         </w:rPr>
-        <w:t xml:space="preserve"> 250–350 T€ Seed für 18–24 Monate decken das Basis-Szenario bis zum Break-even in Jahr 3 inklusive Puffer. Alternative: Bootstrapping – Pro-Abo und Packs finanzieren eine:n Entwickler:in in Teilzeit, das Wachstum verlangsamt sich entsprechend (ungefähr konservatives Szenario). Förderprogramme (EXIST, Gründungsstipendien, Medien-/Edtech-Förderung) werden parallel geprüft.</w:t>
+        <w:t xml:space="preserve"> 500.000 € Pre-Seed für LiveFX und alle Projekte; Mittelverwendung, Liquidität und Reichweite in Abschnitt 11.6.</w:t>
       </w:r>
     </w:p>
     <w:p>
@@ -20900,7 +20910,2163 @@
           <w:sz w:val="21"/>
           <w:szCs w:val="21"/>
         </w:rPr>
-        <w:t xml:space="preserve"> zusätzlich gezählt; sie stecken schon in der B2B-Zeile (0 / 50 / 150 T€). Die Vision erhöht deren Wahrscheinlichkeit, ohne sie zu verdoppeln. XR und Brille sind mit 0 € angesetzt. Der Finanzierungsbedarf (250–350 T€) ändert sich nicht, weil die Vision erst ab Jahr 2 nennenswerte Kosten verursacht und diese aus den Zusatzerlösen trägt.</w:t>
+        <w:t xml:space="preserve"> zusätzlich gezählt; sie stecken schon in der B2B-Zeile (0 / 50 / 150 T€). Die Vision erhöht deren Wahrscheinlichkeit, ohne sie zu verdoppeln. XR und Brille sind mit 0 € angesetzt. Der Finanzierungsbedarf von 500.000 € schließt die Vision-Linien bereits ein: ~20 % der Mittel (100 T€) bringen sie vom Prototyp zum Produkt, zuerst WortBild/Sprachenlernen und die Story-Engine (Abschnitt 11.6).</w:t>
+      </w:r>
+    </w:p>
+    <w:p>
+      <w:pPr>
+        <w:pStyle w:val="Heading2"/>
+        <w:keepNext/>
+        <w:keepLines/>
+      </w:pPr>
+      <w:r>
+        <w:t xml:space="preserve">11.6 Finanzierung: 500.000 € Pre-Seed</w:t>
+      </w:r>
+    </w:p>
+    <w:p>
+      <w:pPr>
+        <w:spacing w:after="140" w:line="288"/>
+        <w:jc w:val="both"/>
+      </w:pPr>
+      <w:r>
+        <w:rPr>
+          <w:rFonts w:ascii="Calibri" w:cs="Calibri" w:eastAsia="Calibri" w:hAnsi="Calibri"/>
+          <w:b/>
+          <w:bCs/>
+          <w:sz w:val="21"/>
+          <w:szCs w:val="21"/>
+        </w:rPr>
+        <w:t xml:space="preserve">Bedarf:</w:t>
+      </w:r>
+      <w:r>
+        <w:rPr>
+          <w:rFonts w:ascii="Calibri" w:cs="Calibri" w:eastAsia="Calibri" w:hAnsi="Calibri"/>
+          <w:sz w:val="21"/>
+          <w:szCs w:val="21"/>
+        </w:rPr>
+        <w:t xml:space="preserve"> </w:t>
+      </w:r>
+      <w:r>
+        <w:rPr>
+          <w:rFonts w:ascii="Calibri" w:cs="Calibri" w:eastAsia="Calibri" w:hAnsi="Calibri"/>
+          <w:b/>
+          <w:bCs/>
+          <w:sz w:val="21"/>
+          <w:szCs w:val="21"/>
+        </w:rPr>
+        <w:t xml:space="preserve">500.000 € Pre-Seed</w:t>
+      </w:r>
+      <w:r>
+        <w:rPr>
+          <w:rFonts w:ascii="Calibri" w:cs="Calibri" w:eastAsia="Calibri" w:hAnsi="Calibri"/>
+          <w:sz w:val="21"/>
+          <w:szCs w:val="21"/>
+        </w:rPr>
+        <w:t xml:space="preserve"> für LiveFX und alle Projekte – das Produkt 2.0 und die Vision-Linien A–D (Erzählfilm, WortBild, Räume, Studio). Die Mittel sind für 24 Monate geplant (J1–J2, 2027–2028). Die Umsatz- und Kostenszenarien aus 11.2–11.5 bleiben unverändert.</w:t>
+      </w:r>
+    </w:p>
+    <w:p>
+      <w:pPr>
+        <w:spacing w:after="140" w:line="288"/>
+        <w:jc w:val="both"/>
+      </w:pPr>
+      <w:r>
+        <w:rPr>
+          <w:rFonts w:ascii="Calibri" w:cs="Calibri" w:eastAsia="Calibri" w:hAnsi="Calibri"/>
+          <w:b/>
+          <w:bCs/>
+          <w:sz w:val="21"/>
+          <w:szCs w:val="21"/>
+        </w:rPr>
+        <w:t xml:space="preserve">Mittelverwendung über 24 Monate – Vorschlag – bitte bestätigen</w:t>
+      </w:r>
+    </w:p>
+    <w:tbl>
+      <w:tblPr>
+        <w:tblW w:type="dxa" w:w="9638"/>
+        <w:tblBorders>
+          <w:top w:val="single" w:color="auto" w:sz="4"/>
+          <w:left w:val="single" w:color="auto" w:sz="4"/>
+          <w:bottom w:val="single" w:color="auto" w:sz="4"/>
+          <w:right w:val="single" w:color="auto" w:sz="4"/>
+          <w:insideH w:val="single" w:color="auto" w:sz="4"/>
+          <w:insideV w:val="single" w:color="auto" w:sz="4"/>
+        </w:tblBorders>
+      </w:tblPr>
+      <w:tblGrid>
+        <w:gridCol w:w="4695"/>
+        <w:gridCol w:w="998"/>
+        <w:gridCol w:w="1387"/>
+        <w:gridCol w:w="2558"/>
+      </w:tblGrid>
+      <w:tr>
+        <w:trPr>
+          <w:cantSplit/>
+          <w:tblHeader/>
+        </w:trPr>
+        <w:tc>
+          <w:tcPr>
+            <w:tcW w:type="dxa" w:w="4695"/>
+            <w:tcBorders>
+              <w:top w:val="single" w:color="C8C8D0" w:sz="4"/>
+              <w:left w:val="single" w:color="C8C8D0" w:sz="4"/>
+              <w:bottom w:val="single" w:color="C8C8D0" w:sz="4"/>
+              <w:right w:val="single" w:color="C8C8D0" w:sz="4"/>
+            </w:tcBorders>
+            <w:shd w:fill="FCE4EE" w:color="auto" w:val="clear"/>
+            <w:tcMar>
+              <w:top w:type="dxa" w:w="50"/>
+              <w:left w:type="dxa" w:w="90"/>
+              <w:bottom w:type="dxa" w:w="50"/>
+              <w:right w:type="dxa" w:w="90"/>
+            </w:tcMar>
+            <w:vAlign w:val="center"/>
+          </w:tcPr>
+          <w:p>
+            <w:pPr>
+              <w:spacing w:after="20" w:before="20" w:line="252"/>
+              <w:jc w:val="left"/>
+            </w:pPr>
+            <w:r>
+              <w:rPr>
+                <w:rFonts w:ascii="Calibri" w:cs="Calibri" w:eastAsia="Calibri" w:hAnsi="Calibri"/>
+                <w:b/>
+                <w:bCs/>
+                <w:color w:val="0F1115"/>
+                <w:sz w:val="18"/>
+                <w:szCs w:val="18"/>
+              </w:rPr>
+              <w:t xml:space="preserve">Bereich</w:t>
+            </w:r>
+          </w:p>
+        </w:tc>
+        <w:tc>
+          <w:tcPr>
+            <w:tcW w:type="dxa" w:w="998"/>
+            <w:tcBorders>
+              <w:top w:val="single" w:color="C8C8D0" w:sz="4"/>
+              <w:left w:val="single" w:color="C8C8D0" w:sz="4"/>
+              <w:bottom w:val="single" w:color="C8C8D0" w:sz="4"/>
+              <w:right w:val="single" w:color="C8C8D0" w:sz="4"/>
+            </w:tcBorders>
+            <w:shd w:fill="FCE4EE" w:color="auto" w:val="clear"/>
+            <w:tcMar>
+              <w:top w:type="dxa" w:w="50"/>
+              <w:left w:type="dxa" w:w="90"/>
+              <w:bottom w:type="dxa" w:w="50"/>
+              <w:right w:type="dxa" w:w="90"/>
+            </w:tcMar>
+            <w:vAlign w:val="center"/>
+          </w:tcPr>
+          <w:p>
+            <w:pPr>
+              <w:spacing w:after="20" w:before="20" w:line="252"/>
+              <w:jc w:val="left"/>
+            </w:pPr>
+            <w:r>
+              <w:rPr>
+                <w:rFonts w:ascii="Calibri" w:cs="Calibri" w:eastAsia="Calibri" w:hAnsi="Calibri"/>
+                <w:b/>
+                <w:bCs/>
+                <w:color w:val="0F1115"/>
+                <w:sz w:val="18"/>
+                <w:szCs w:val="18"/>
+              </w:rPr>
+              <w:t xml:space="preserve">Anteil</w:t>
+            </w:r>
+          </w:p>
+        </w:tc>
+        <w:tc>
+          <w:tcPr>
+            <w:tcW w:type="dxa" w:w="1387"/>
+            <w:tcBorders>
+              <w:top w:val="single" w:color="C8C8D0" w:sz="4"/>
+              <w:left w:val="single" w:color="C8C8D0" w:sz="4"/>
+              <w:bottom w:val="single" w:color="C8C8D0" w:sz="4"/>
+              <w:right w:val="single" w:color="C8C8D0" w:sz="4"/>
+            </w:tcBorders>
+            <w:shd w:fill="FCE4EE" w:color="auto" w:val="clear"/>
+            <w:tcMar>
+              <w:top w:type="dxa" w:w="50"/>
+              <w:left w:type="dxa" w:w="90"/>
+              <w:bottom w:type="dxa" w:w="50"/>
+              <w:right w:type="dxa" w:w="90"/>
+            </w:tcMar>
+            <w:vAlign w:val="center"/>
+          </w:tcPr>
+          <w:p>
+            <w:pPr>
+              <w:spacing w:after="20" w:before="20" w:line="252"/>
+              <w:jc w:val="left"/>
+            </w:pPr>
+            <w:r>
+              <w:rPr>
+                <w:rFonts w:ascii="Calibri" w:cs="Calibri" w:eastAsia="Calibri" w:hAnsi="Calibri"/>
+                <w:b/>
+                <w:bCs/>
+                <w:color w:val="0F1115"/>
+                <w:sz w:val="18"/>
+                <w:szCs w:val="18"/>
+              </w:rPr>
+              <w:t xml:space="preserve">Betrag</w:t>
+            </w:r>
+          </w:p>
+        </w:tc>
+        <w:tc>
+          <w:tcPr>
+            <w:tcW w:type="dxa" w:w="2558"/>
+            <w:tcBorders>
+              <w:top w:val="single" w:color="C8C8D0" w:sz="4"/>
+              <w:left w:val="single" w:color="C8C8D0" w:sz="4"/>
+              <w:bottom w:val="single" w:color="C8C8D0" w:sz="4"/>
+              <w:right w:val="single" w:color="C8C8D0" w:sz="4"/>
+            </w:tcBorders>
+            <w:shd w:fill="FCE4EE" w:color="auto" w:val="clear"/>
+            <w:tcMar>
+              <w:top w:type="dxa" w:w="50"/>
+              <w:left w:type="dxa" w:w="90"/>
+              <w:bottom w:type="dxa" w:w="50"/>
+              <w:right w:type="dxa" w:w="90"/>
+            </w:tcMar>
+            <w:vAlign w:val="center"/>
+          </w:tcPr>
+          <w:p>
+            <w:pPr>
+              <w:spacing w:after="20" w:before="20" w:line="252"/>
+              <w:jc w:val="left"/>
+            </w:pPr>
+            <w:r>
+              <w:rPr>
+                <w:rFonts w:ascii="Calibri" w:cs="Calibri" w:eastAsia="Calibri" w:hAnsi="Calibri"/>
+                <w:b/>
+                <w:bCs/>
+                <w:color w:val="0F1115"/>
+                <w:sz w:val="18"/>
+                <w:szCs w:val="18"/>
+              </w:rPr>
+              <w:t xml:space="preserve">Bezug im Finanzplan (J1 + J2, T€)</w:t>
+            </w:r>
+          </w:p>
+        </w:tc>
+      </w:tr>
+      <w:tr>
+        <w:trPr>
+          <w:cantSplit/>
+          <w:tblHeader w:val="off"/>
+        </w:trPr>
+        <w:tc>
+          <w:tcPr>
+            <w:tcW w:type="dxa" w:w="4695"/>
+            <w:tcBorders>
+              <w:top w:val="single" w:color="C8C8D0" w:sz="4"/>
+              <w:left w:val="single" w:color="C8C8D0" w:sz="4"/>
+              <w:bottom w:val="single" w:color="C8C8D0" w:sz="4"/>
+              <w:right w:val="single" w:color="C8C8D0" w:sz="4"/>
+            </w:tcBorders>
+            <w:tcMar>
+              <w:top w:type="dxa" w:w="50"/>
+              <w:left w:type="dxa" w:w="90"/>
+              <w:bottom w:type="dxa" w:w="50"/>
+              <w:right w:type="dxa" w:w="90"/>
+            </w:tcMar>
+            <w:vAlign w:val="center"/>
+          </w:tcPr>
+          <w:p>
+            <w:pPr>
+              <w:spacing w:after="20" w:before="20" w:line="252"/>
+              <w:jc w:val="left"/>
+            </w:pPr>
+            <w:r>
+              <w:rPr>
+                <w:rFonts w:ascii="Calibri" w:cs="Calibri" w:eastAsia="Calibri" w:hAnsi="Calibri"/>
+                <w:sz w:val="18"/>
+                <w:szCs w:val="18"/>
+              </w:rPr>
+              <w:t xml:space="preserve">Produkt- und Engineering-Team</w:t>
+            </w:r>
+          </w:p>
+        </w:tc>
+        <w:tc>
+          <w:tcPr>
+            <w:tcW w:type="dxa" w:w="998"/>
+            <w:tcBorders>
+              <w:top w:val="single" w:color="C8C8D0" w:sz="4"/>
+              <w:left w:val="single" w:color="C8C8D0" w:sz="4"/>
+              <w:bottom w:val="single" w:color="C8C8D0" w:sz="4"/>
+              <w:right w:val="single" w:color="C8C8D0" w:sz="4"/>
+            </w:tcBorders>
+            <w:tcMar>
+              <w:top w:type="dxa" w:w="50"/>
+              <w:left w:type="dxa" w:w="90"/>
+              <w:bottom w:type="dxa" w:w="50"/>
+              <w:right w:type="dxa" w:w="90"/>
+            </w:tcMar>
+            <w:vAlign w:val="center"/>
+          </w:tcPr>
+          <w:p>
+            <w:pPr>
+              <w:spacing w:after="20" w:before="20" w:line="252"/>
+              <w:jc w:val="right"/>
+            </w:pPr>
+            <w:r>
+              <w:rPr>
+                <w:rFonts w:ascii="Calibri" w:cs="Calibri" w:eastAsia="Calibri" w:hAnsi="Calibri"/>
+                <w:sz w:val="18"/>
+                <w:szCs w:val="18"/>
+              </w:rPr>
+              <w:t xml:space="preserve">~50 %</w:t>
+            </w:r>
+          </w:p>
+        </w:tc>
+        <w:tc>
+          <w:tcPr>
+            <w:tcW w:type="dxa" w:w="1387"/>
+            <w:tcBorders>
+              <w:top w:val="single" w:color="C8C8D0" w:sz="4"/>
+              <w:left w:val="single" w:color="C8C8D0" w:sz="4"/>
+              <w:bottom w:val="single" w:color="C8C8D0" w:sz="4"/>
+              <w:right w:val="single" w:color="C8C8D0" w:sz="4"/>
+            </w:tcBorders>
+            <w:tcMar>
+              <w:top w:type="dxa" w:w="50"/>
+              <w:left w:type="dxa" w:w="90"/>
+              <w:bottom w:type="dxa" w:w="50"/>
+              <w:right w:type="dxa" w:w="90"/>
+            </w:tcMar>
+            <w:vAlign w:val="center"/>
+          </w:tcPr>
+          <w:p>
+            <w:pPr>
+              <w:spacing w:after="20" w:before="20" w:line="252"/>
+              <w:jc w:val="right"/>
+            </w:pPr>
+            <w:r>
+              <w:rPr>
+                <w:rFonts w:ascii="Calibri" w:cs="Calibri" w:eastAsia="Calibri" w:hAnsi="Calibri"/>
+                <w:sz w:val="18"/>
+                <w:szCs w:val="18"/>
+              </w:rPr>
+              <w:t xml:space="preserve">250.000 €</w:t>
+            </w:r>
+          </w:p>
+        </w:tc>
+        <w:tc>
+          <w:tcPr>
+            <w:tcW w:type="dxa" w:w="2558"/>
+            <w:tcBorders>
+              <w:top w:val="single" w:color="C8C8D0" w:sz="4"/>
+              <w:left w:val="single" w:color="C8C8D0" w:sz="4"/>
+              <w:bottom w:val="single" w:color="C8C8D0" w:sz="4"/>
+              <w:right w:val="single" w:color="C8C8D0" w:sz="4"/>
+            </w:tcBorders>
+            <w:tcMar>
+              <w:top w:type="dxa" w:w="50"/>
+              <w:left w:type="dxa" w:w="90"/>
+              <w:bottom w:type="dxa" w:w="50"/>
+              <w:right w:type="dxa" w:w="90"/>
+            </w:tcMar>
+            <w:vAlign w:val="center"/>
+          </w:tcPr>
+          <w:p>
+            <w:pPr>
+              <w:spacing w:after="20" w:before="20" w:line="252"/>
+              <w:jc w:val="left"/>
+            </w:pPr>
+            <w:r>
+              <w:rPr>
+                <w:rFonts w:ascii="Calibri" w:cs="Calibri" w:eastAsia="Calibri" w:hAnsi="Calibri"/>
+                <w:sz w:val="18"/>
+                <w:szCs w:val="18"/>
+              </w:rPr>
+              <w:t xml:space="preserve">Personal inkl. Gründergehalt 373 (11.3)</w:t>
+            </w:r>
+          </w:p>
+        </w:tc>
+      </w:tr>
+      <w:tr>
+        <w:trPr>
+          <w:cantSplit/>
+          <w:tblHeader w:val="off"/>
+        </w:trPr>
+        <w:tc>
+          <w:tcPr>
+            <w:tcW w:type="dxa" w:w="4695"/>
+            <w:tcBorders>
+              <w:top w:val="single" w:color="C8C8D0" w:sz="4"/>
+              <w:left w:val="single" w:color="C8C8D0" w:sz="4"/>
+              <w:bottom w:val="single" w:color="C8C8D0" w:sz="4"/>
+              <w:right w:val="single" w:color="C8C8D0" w:sz="4"/>
+            </w:tcBorders>
+            <w:shd w:fill="F7F7FA" w:color="auto" w:val="clear"/>
+            <w:tcMar>
+              <w:top w:type="dxa" w:w="50"/>
+              <w:left w:type="dxa" w:w="90"/>
+              <w:bottom w:type="dxa" w:w="50"/>
+              <w:right w:type="dxa" w:w="90"/>
+            </w:tcMar>
+            <w:vAlign w:val="center"/>
+          </w:tcPr>
+          <w:p>
+            <w:pPr>
+              <w:spacing w:after="20" w:before="20" w:line="252"/>
+              <w:jc w:val="left"/>
+            </w:pPr>
+            <w:r>
+              <w:rPr>
+                <w:rFonts w:ascii="Calibri" w:cs="Calibri" w:eastAsia="Calibri" w:hAnsi="Calibri"/>
+                <w:sz w:val="18"/>
+                <w:szCs w:val="18"/>
+              </w:rPr>
+              <w:t xml:space="preserve">Vision-Linien vom Prototyp zum Produkt – zuerst WortBild/Sprachenlernen und Story-Engine (Erzählfilm)</w:t>
+            </w:r>
+          </w:p>
+        </w:tc>
+        <w:tc>
+          <w:tcPr>
+            <w:tcW w:type="dxa" w:w="998"/>
+            <w:tcBorders>
+              <w:top w:val="single" w:color="C8C8D0" w:sz="4"/>
+              <w:left w:val="single" w:color="C8C8D0" w:sz="4"/>
+              <w:bottom w:val="single" w:color="C8C8D0" w:sz="4"/>
+              <w:right w:val="single" w:color="C8C8D0" w:sz="4"/>
+            </w:tcBorders>
+            <w:shd w:fill="F7F7FA" w:color="auto" w:val="clear"/>
+            <w:tcMar>
+              <w:top w:type="dxa" w:w="50"/>
+              <w:left w:type="dxa" w:w="90"/>
+              <w:bottom w:type="dxa" w:w="50"/>
+              <w:right w:type="dxa" w:w="90"/>
+            </w:tcMar>
+            <w:vAlign w:val="center"/>
+          </w:tcPr>
+          <w:p>
+            <w:pPr>
+              <w:spacing w:after="20" w:before="20" w:line="252"/>
+              <w:jc w:val="right"/>
+            </w:pPr>
+            <w:r>
+              <w:rPr>
+                <w:rFonts w:ascii="Calibri" w:cs="Calibri" w:eastAsia="Calibri" w:hAnsi="Calibri"/>
+                <w:sz w:val="18"/>
+                <w:szCs w:val="18"/>
+              </w:rPr>
+              <w:t xml:space="preserve">~20 %</w:t>
+            </w:r>
+          </w:p>
+        </w:tc>
+        <w:tc>
+          <w:tcPr>
+            <w:tcW w:type="dxa" w:w="1387"/>
+            <w:tcBorders>
+              <w:top w:val="single" w:color="C8C8D0" w:sz="4"/>
+              <w:left w:val="single" w:color="C8C8D0" w:sz="4"/>
+              <w:bottom w:val="single" w:color="C8C8D0" w:sz="4"/>
+              <w:right w:val="single" w:color="C8C8D0" w:sz="4"/>
+            </w:tcBorders>
+            <w:shd w:fill="F7F7FA" w:color="auto" w:val="clear"/>
+            <w:tcMar>
+              <w:top w:type="dxa" w:w="50"/>
+              <w:left w:type="dxa" w:w="90"/>
+              <w:bottom w:type="dxa" w:w="50"/>
+              <w:right w:type="dxa" w:w="90"/>
+            </w:tcMar>
+            <w:vAlign w:val="center"/>
+          </w:tcPr>
+          <w:p>
+            <w:pPr>
+              <w:spacing w:after="20" w:before="20" w:line="252"/>
+              <w:jc w:val="right"/>
+            </w:pPr>
+            <w:r>
+              <w:rPr>
+                <w:rFonts w:ascii="Calibri" w:cs="Calibri" w:eastAsia="Calibri" w:hAnsi="Calibri"/>
+                <w:sz w:val="18"/>
+                <w:szCs w:val="18"/>
+              </w:rPr>
+              <w:t xml:space="preserve">100.000 €</w:t>
+            </w:r>
+          </w:p>
+        </w:tc>
+        <w:tc>
+          <w:tcPr>
+            <w:tcW w:type="dxa" w:w="2558"/>
+            <w:tcBorders>
+              <w:top w:val="single" w:color="C8C8D0" w:sz="4"/>
+              <w:left w:val="single" w:color="C8C8D0" w:sz="4"/>
+              <w:bottom w:val="single" w:color="C8C8D0" w:sz="4"/>
+              <w:right w:val="single" w:color="C8C8D0" w:sz="4"/>
+            </w:tcBorders>
+            <w:shd w:fill="F7F7FA" w:color="auto" w:val="clear"/>
+            <w:tcMar>
+              <w:top w:type="dxa" w:w="50"/>
+              <w:left w:type="dxa" w:w="90"/>
+              <w:bottom w:type="dxa" w:w="50"/>
+              <w:right w:type="dxa" w:w="90"/>
+            </w:tcMar>
+            <w:vAlign w:val="center"/>
+          </w:tcPr>
+          <w:p>
+            <w:pPr>
+              <w:spacing w:after="20" w:before="20" w:line="252"/>
+              <w:jc w:val="left"/>
+            </w:pPr>
+            <w:r>
+              <w:rPr>
+                <w:rFonts w:ascii="Calibri" w:cs="Calibri" w:eastAsia="Calibri" w:hAnsi="Calibri"/>
+                <w:sz w:val="18"/>
+                <w:szCs w:val="18"/>
+              </w:rPr>
+              <w:t xml:space="preserve">Zusatzkosten Vision 145 (11.5)</w:t>
+            </w:r>
+          </w:p>
+        </w:tc>
+      </w:tr>
+      <w:tr>
+        <w:trPr>
+          <w:cantSplit/>
+          <w:tblHeader w:val="off"/>
+        </w:trPr>
+        <w:tc>
+          <w:tcPr>
+            <w:tcW w:type="dxa" w:w="4695"/>
+            <w:tcBorders>
+              <w:top w:val="single" w:color="C8C8D0" w:sz="4"/>
+              <w:left w:val="single" w:color="C8C8D0" w:sz="4"/>
+              <w:bottom w:val="single" w:color="C8C8D0" w:sz="4"/>
+              <w:right w:val="single" w:color="C8C8D0" w:sz="4"/>
+            </w:tcBorders>
+            <w:tcMar>
+              <w:top w:type="dxa" w:w="50"/>
+              <w:left w:type="dxa" w:w="90"/>
+              <w:bottom w:type="dxa" w:w="50"/>
+              <w:right w:type="dxa" w:w="90"/>
+            </w:tcMar>
+            <w:vAlign w:val="center"/>
+          </w:tcPr>
+          <w:p>
+            <w:pPr>
+              <w:spacing w:after="20" w:before="20" w:line="252"/>
+              <w:jc w:val="left"/>
+            </w:pPr>
+            <w:r>
+              <w:rPr>
+                <w:rFonts w:ascii="Calibri" w:cs="Calibri" w:eastAsia="Calibri" w:hAnsi="Calibri"/>
+                <w:sz w:val="18"/>
+                <w:szCs w:val="18"/>
+              </w:rPr>
+              <w:t xml:space="preserve">Go-to-Market, Creator-Partnerprogramm, Piloten</w:t>
+            </w:r>
+          </w:p>
+        </w:tc>
+        <w:tc>
+          <w:tcPr>
+            <w:tcW w:type="dxa" w:w="998"/>
+            <w:tcBorders>
+              <w:top w:val="single" w:color="C8C8D0" w:sz="4"/>
+              <w:left w:val="single" w:color="C8C8D0" w:sz="4"/>
+              <w:bottom w:val="single" w:color="C8C8D0" w:sz="4"/>
+              <w:right w:val="single" w:color="C8C8D0" w:sz="4"/>
+            </w:tcBorders>
+            <w:tcMar>
+              <w:top w:type="dxa" w:w="50"/>
+              <w:left w:type="dxa" w:w="90"/>
+              <w:bottom w:type="dxa" w:w="50"/>
+              <w:right w:type="dxa" w:w="90"/>
+            </w:tcMar>
+            <w:vAlign w:val="center"/>
+          </w:tcPr>
+          <w:p>
+            <w:pPr>
+              <w:spacing w:after="20" w:before="20" w:line="252"/>
+              <w:jc w:val="right"/>
+            </w:pPr>
+            <w:r>
+              <w:rPr>
+                <w:rFonts w:ascii="Calibri" w:cs="Calibri" w:eastAsia="Calibri" w:hAnsi="Calibri"/>
+                <w:sz w:val="18"/>
+                <w:szCs w:val="18"/>
+              </w:rPr>
+              <w:t xml:space="preserve">~15 %</w:t>
+            </w:r>
+          </w:p>
+        </w:tc>
+        <w:tc>
+          <w:tcPr>
+            <w:tcW w:type="dxa" w:w="1387"/>
+            <w:tcBorders>
+              <w:top w:val="single" w:color="C8C8D0" w:sz="4"/>
+              <w:left w:val="single" w:color="C8C8D0" w:sz="4"/>
+              <w:bottom w:val="single" w:color="C8C8D0" w:sz="4"/>
+              <w:right w:val="single" w:color="C8C8D0" w:sz="4"/>
+            </w:tcBorders>
+            <w:tcMar>
+              <w:top w:type="dxa" w:w="50"/>
+              <w:left w:type="dxa" w:w="90"/>
+              <w:bottom w:type="dxa" w:w="50"/>
+              <w:right w:type="dxa" w:w="90"/>
+            </w:tcMar>
+            <w:vAlign w:val="center"/>
+          </w:tcPr>
+          <w:p>
+            <w:pPr>
+              <w:spacing w:after="20" w:before="20" w:line="252"/>
+              <w:jc w:val="right"/>
+            </w:pPr>
+            <w:r>
+              <w:rPr>
+                <w:rFonts w:ascii="Calibri" w:cs="Calibri" w:eastAsia="Calibri" w:hAnsi="Calibri"/>
+                <w:sz w:val="18"/>
+                <w:szCs w:val="18"/>
+              </w:rPr>
+              <w:t xml:space="preserve">75.000 €</w:t>
+            </w:r>
+          </w:p>
+        </w:tc>
+        <w:tc>
+          <w:tcPr>
+            <w:tcW w:type="dxa" w:w="2558"/>
+            <w:tcBorders>
+              <w:top w:val="single" w:color="C8C8D0" w:sz="4"/>
+              <w:left w:val="single" w:color="C8C8D0" w:sz="4"/>
+              <w:bottom w:val="single" w:color="C8C8D0" w:sz="4"/>
+              <w:right w:val="single" w:color="C8C8D0" w:sz="4"/>
+            </w:tcBorders>
+            <w:tcMar>
+              <w:top w:type="dxa" w:w="50"/>
+              <w:left w:type="dxa" w:w="90"/>
+              <w:bottom w:type="dxa" w:w="50"/>
+              <w:right w:type="dxa" w:w="90"/>
+            </w:tcMar>
+            <w:vAlign w:val="center"/>
+          </w:tcPr>
+          <w:p>
+            <w:pPr>
+              <w:spacing w:after="20" w:before="20" w:line="252"/>
+              <w:jc w:val="left"/>
+            </w:pPr>
+            <w:r>
+              <w:rPr>
+                <w:rFonts w:ascii="Calibri" w:cs="Calibri" w:eastAsia="Calibri" w:hAnsi="Calibri"/>
+                <w:sz w:val="18"/>
+                <w:szCs w:val="18"/>
+              </w:rPr>
+              <w:t xml:space="preserve">Marketing, Creator-Programm, Events 85 (11.3)</w:t>
+            </w:r>
+          </w:p>
+        </w:tc>
+      </w:tr>
+      <w:tr>
+        <w:trPr>
+          <w:cantSplit/>
+          <w:tblHeader w:val="off"/>
+        </w:trPr>
+        <w:tc>
+          <w:tcPr>
+            <w:tcW w:type="dxa" w:w="4695"/>
+            <w:tcBorders>
+              <w:top w:val="single" w:color="C8C8D0" w:sz="4"/>
+              <w:left w:val="single" w:color="C8C8D0" w:sz="4"/>
+              <w:bottom w:val="single" w:color="C8C8D0" w:sz="4"/>
+              <w:right w:val="single" w:color="C8C8D0" w:sz="4"/>
+            </w:tcBorders>
+            <w:shd w:fill="F7F7FA" w:color="auto" w:val="clear"/>
+            <w:tcMar>
+              <w:top w:type="dxa" w:w="50"/>
+              <w:left w:type="dxa" w:w="90"/>
+              <w:bottom w:type="dxa" w:w="50"/>
+              <w:right w:type="dxa" w:w="90"/>
+            </w:tcMar>
+            <w:vAlign w:val="center"/>
+          </w:tcPr>
+          <w:p>
+            <w:pPr>
+              <w:spacing w:after="20" w:before="20" w:line="252"/>
+              <w:jc w:val="left"/>
+            </w:pPr>
+            <w:r>
+              <w:rPr>
+                <w:rFonts w:ascii="Calibri" w:cs="Calibri" w:eastAsia="Calibri" w:hAnsi="Calibri"/>
+                <w:sz w:val="18"/>
+                <w:szCs w:val="18"/>
+              </w:rPr>
+              <w:t xml:space="preserve">Recht, Marke, Datenschutz</w:t>
+            </w:r>
+          </w:p>
+        </w:tc>
+        <w:tc>
+          <w:tcPr>
+            <w:tcW w:type="dxa" w:w="998"/>
+            <w:tcBorders>
+              <w:top w:val="single" w:color="C8C8D0" w:sz="4"/>
+              <w:left w:val="single" w:color="C8C8D0" w:sz="4"/>
+              <w:bottom w:val="single" w:color="C8C8D0" w:sz="4"/>
+              <w:right w:val="single" w:color="C8C8D0" w:sz="4"/>
+            </w:tcBorders>
+            <w:shd w:fill="F7F7FA" w:color="auto" w:val="clear"/>
+            <w:tcMar>
+              <w:top w:type="dxa" w:w="50"/>
+              <w:left w:type="dxa" w:w="90"/>
+              <w:bottom w:type="dxa" w:w="50"/>
+              <w:right w:type="dxa" w:w="90"/>
+            </w:tcMar>
+            <w:vAlign w:val="center"/>
+          </w:tcPr>
+          <w:p>
+            <w:pPr>
+              <w:spacing w:after="20" w:before="20" w:line="252"/>
+              <w:jc w:val="right"/>
+            </w:pPr>
+            <w:r>
+              <w:rPr>
+                <w:rFonts w:ascii="Calibri" w:cs="Calibri" w:eastAsia="Calibri" w:hAnsi="Calibri"/>
+                <w:sz w:val="18"/>
+                <w:szCs w:val="18"/>
+              </w:rPr>
+              <w:t xml:space="preserve">~10 %</w:t>
+            </w:r>
+          </w:p>
+        </w:tc>
+        <w:tc>
+          <w:tcPr>
+            <w:tcW w:type="dxa" w:w="1387"/>
+            <w:tcBorders>
+              <w:top w:val="single" w:color="C8C8D0" w:sz="4"/>
+              <w:left w:val="single" w:color="C8C8D0" w:sz="4"/>
+              <w:bottom w:val="single" w:color="C8C8D0" w:sz="4"/>
+              <w:right w:val="single" w:color="C8C8D0" w:sz="4"/>
+            </w:tcBorders>
+            <w:shd w:fill="F7F7FA" w:color="auto" w:val="clear"/>
+            <w:tcMar>
+              <w:top w:type="dxa" w:w="50"/>
+              <w:left w:type="dxa" w:w="90"/>
+              <w:bottom w:type="dxa" w:w="50"/>
+              <w:right w:type="dxa" w:w="90"/>
+            </w:tcMar>
+            <w:vAlign w:val="center"/>
+          </w:tcPr>
+          <w:p>
+            <w:pPr>
+              <w:spacing w:after="20" w:before="20" w:line="252"/>
+              <w:jc w:val="right"/>
+            </w:pPr>
+            <w:r>
+              <w:rPr>
+                <w:rFonts w:ascii="Calibri" w:cs="Calibri" w:eastAsia="Calibri" w:hAnsi="Calibri"/>
+                <w:sz w:val="18"/>
+                <w:szCs w:val="18"/>
+              </w:rPr>
+              <w:t xml:space="preserve">50.000 €</w:t>
+            </w:r>
+          </w:p>
+        </w:tc>
+        <w:tc>
+          <w:tcPr>
+            <w:tcW w:type="dxa" w:w="2558"/>
+            <w:tcBorders>
+              <w:top w:val="single" w:color="C8C8D0" w:sz="4"/>
+              <w:left w:val="single" w:color="C8C8D0" w:sz="4"/>
+              <w:bottom w:val="single" w:color="C8C8D0" w:sz="4"/>
+              <w:right w:val="single" w:color="C8C8D0" w:sz="4"/>
+            </w:tcBorders>
+            <w:shd w:fill="F7F7FA" w:color="auto" w:val="clear"/>
+            <w:tcMar>
+              <w:top w:type="dxa" w:w="50"/>
+              <w:left w:type="dxa" w:w="90"/>
+              <w:bottom w:type="dxa" w:w="50"/>
+              <w:right w:type="dxa" w:w="90"/>
+            </w:tcMar>
+            <w:vAlign w:val="center"/>
+          </w:tcPr>
+          <w:p>
+            <w:pPr>
+              <w:spacing w:after="20" w:before="20" w:line="252"/>
+              <w:jc w:val="left"/>
+            </w:pPr>
+            <w:r>
+              <w:rPr>
+                <w:rFonts w:ascii="Calibri" w:cs="Calibri" w:eastAsia="Calibri" w:hAnsi="Calibri"/>
+                <w:sz w:val="18"/>
+                <w:szCs w:val="18"/>
+              </w:rPr>
+              <w:t xml:space="preserve">Recht, Marke, Steuer, Verwaltung 32 (11.3)</w:t>
+            </w:r>
+          </w:p>
+        </w:tc>
+      </w:tr>
+      <w:tr>
+        <w:trPr>
+          <w:cantSplit/>
+          <w:tblHeader w:val="off"/>
+        </w:trPr>
+        <w:tc>
+          <w:tcPr>
+            <w:tcW w:type="dxa" w:w="4695"/>
+            <w:tcBorders>
+              <w:top w:val="single" w:color="C8C8D0" w:sz="4"/>
+              <w:left w:val="single" w:color="C8C8D0" w:sz="4"/>
+              <w:bottom w:val="single" w:color="C8C8D0" w:sz="4"/>
+              <w:right w:val="single" w:color="C8C8D0" w:sz="4"/>
+            </w:tcBorders>
+            <w:tcMar>
+              <w:top w:type="dxa" w:w="50"/>
+              <w:left w:type="dxa" w:w="90"/>
+              <w:bottom w:type="dxa" w:w="50"/>
+              <w:right w:type="dxa" w:w="90"/>
+            </w:tcMar>
+            <w:vAlign w:val="center"/>
+          </w:tcPr>
+          <w:p>
+            <w:pPr>
+              <w:spacing w:after="20" w:before="20" w:line="252"/>
+              <w:jc w:val="left"/>
+            </w:pPr>
+            <w:r>
+              <w:rPr>
+                <w:rFonts w:ascii="Calibri" w:cs="Calibri" w:eastAsia="Calibri" w:hAnsi="Calibri"/>
+                <w:sz w:val="18"/>
+                <w:szCs w:val="18"/>
+              </w:rPr>
+              <w:t xml:space="preserve">Reserve</w:t>
+            </w:r>
+          </w:p>
+        </w:tc>
+        <w:tc>
+          <w:tcPr>
+            <w:tcW w:type="dxa" w:w="998"/>
+            <w:tcBorders>
+              <w:top w:val="single" w:color="C8C8D0" w:sz="4"/>
+              <w:left w:val="single" w:color="C8C8D0" w:sz="4"/>
+              <w:bottom w:val="single" w:color="C8C8D0" w:sz="4"/>
+              <w:right w:val="single" w:color="C8C8D0" w:sz="4"/>
+            </w:tcBorders>
+            <w:tcMar>
+              <w:top w:type="dxa" w:w="50"/>
+              <w:left w:type="dxa" w:w="90"/>
+              <w:bottom w:type="dxa" w:w="50"/>
+              <w:right w:type="dxa" w:w="90"/>
+            </w:tcMar>
+            <w:vAlign w:val="center"/>
+          </w:tcPr>
+          <w:p>
+            <w:pPr>
+              <w:spacing w:after="20" w:before="20" w:line="252"/>
+              <w:jc w:val="right"/>
+            </w:pPr>
+            <w:r>
+              <w:rPr>
+                <w:rFonts w:ascii="Calibri" w:cs="Calibri" w:eastAsia="Calibri" w:hAnsi="Calibri"/>
+                <w:sz w:val="18"/>
+                <w:szCs w:val="18"/>
+              </w:rPr>
+              <w:t xml:space="preserve">~5 %</w:t>
+            </w:r>
+          </w:p>
+        </w:tc>
+        <w:tc>
+          <w:tcPr>
+            <w:tcW w:type="dxa" w:w="1387"/>
+            <w:tcBorders>
+              <w:top w:val="single" w:color="C8C8D0" w:sz="4"/>
+              <w:left w:val="single" w:color="C8C8D0" w:sz="4"/>
+              <w:bottom w:val="single" w:color="C8C8D0" w:sz="4"/>
+              <w:right w:val="single" w:color="C8C8D0" w:sz="4"/>
+            </w:tcBorders>
+            <w:tcMar>
+              <w:top w:type="dxa" w:w="50"/>
+              <w:left w:type="dxa" w:w="90"/>
+              <w:bottom w:type="dxa" w:w="50"/>
+              <w:right w:type="dxa" w:w="90"/>
+            </w:tcMar>
+            <w:vAlign w:val="center"/>
+          </w:tcPr>
+          <w:p>
+            <w:pPr>
+              <w:spacing w:after="20" w:before="20" w:line="252"/>
+              <w:jc w:val="right"/>
+            </w:pPr>
+            <w:r>
+              <w:rPr>
+                <w:rFonts w:ascii="Calibri" w:cs="Calibri" w:eastAsia="Calibri" w:hAnsi="Calibri"/>
+                <w:sz w:val="18"/>
+                <w:szCs w:val="18"/>
+              </w:rPr>
+              <w:t xml:space="preserve">25.000 €</w:t>
+            </w:r>
+          </w:p>
+        </w:tc>
+        <w:tc>
+          <w:tcPr>
+            <w:tcW w:type="dxa" w:w="2558"/>
+            <w:tcBorders>
+              <w:top w:val="single" w:color="C8C8D0" w:sz="4"/>
+              <w:left w:val="single" w:color="C8C8D0" w:sz="4"/>
+              <w:bottom w:val="single" w:color="C8C8D0" w:sz="4"/>
+              <w:right w:val="single" w:color="C8C8D0" w:sz="4"/>
+            </w:tcBorders>
+            <w:tcMar>
+              <w:top w:type="dxa" w:w="50"/>
+              <w:left w:type="dxa" w:w="90"/>
+              <w:bottom w:type="dxa" w:w="50"/>
+              <w:right w:type="dxa" w:w="90"/>
+            </w:tcMar>
+            <w:vAlign w:val="center"/>
+          </w:tcPr>
+          <w:p>
+            <w:pPr>
+              <w:spacing w:after="20" w:before="20" w:line="252"/>
+              <w:jc w:val="left"/>
+            </w:pPr>
+            <w:r>
+              <w:rPr>
+                <w:rFonts w:ascii="Calibri" w:cs="Calibri" w:eastAsia="Calibri" w:hAnsi="Calibri"/>
+                <w:sz w:val="18"/>
+                <w:szCs w:val="18"/>
+              </w:rPr>
+              <w:t xml:space="preserve">–</w:t>
+            </w:r>
+          </w:p>
+        </w:tc>
+      </w:tr>
+      <w:tr>
+        <w:trPr>
+          <w:cantSplit/>
+          <w:tblHeader w:val="off"/>
+        </w:trPr>
+        <w:tc>
+          <w:tcPr>
+            <w:tcW w:type="dxa" w:w="4695"/>
+            <w:tcBorders>
+              <w:top w:val="single" w:color="C8C8D0" w:sz="4"/>
+              <w:left w:val="single" w:color="C8C8D0" w:sz="4"/>
+              <w:bottom w:val="single" w:color="C8C8D0" w:sz="4"/>
+              <w:right w:val="single" w:color="C8C8D0" w:sz="4"/>
+            </w:tcBorders>
+            <w:shd w:fill="F7F7FA" w:color="auto" w:val="clear"/>
+            <w:tcMar>
+              <w:top w:type="dxa" w:w="50"/>
+              <w:left w:type="dxa" w:w="90"/>
+              <w:bottom w:type="dxa" w:w="50"/>
+              <w:right w:type="dxa" w:w="90"/>
+            </w:tcMar>
+            <w:vAlign w:val="center"/>
+          </w:tcPr>
+          <w:p>
+            <w:pPr>
+              <w:spacing w:after="20" w:before="20" w:line="252"/>
+              <w:jc w:val="left"/>
+            </w:pPr>
+            <w:r>
+              <w:rPr>
+                <w:rFonts w:ascii="Calibri" w:cs="Calibri" w:eastAsia="Calibri" w:hAnsi="Calibri"/>
+                <w:b/>
+                <w:bCs/>
+                <w:sz w:val="18"/>
+                <w:szCs w:val="18"/>
+              </w:rPr>
+              <w:t xml:space="preserve">Summe</w:t>
+            </w:r>
+          </w:p>
+        </w:tc>
+        <w:tc>
+          <w:tcPr>
+            <w:tcW w:type="dxa" w:w="998"/>
+            <w:tcBorders>
+              <w:top w:val="single" w:color="C8C8D0" w:sz="4"/>
+              <w:left w:val="single" w:color="C8C8D0" w:sz="4"/>
+              <w:bottom w:val="single" w:color="C8C8D0" w:sz="4"/>
+              <w:right w:val="single" w:color="C8C8D0" w:sz="4"/>
+            </w:tcBorders>
+            <w:shd w:fill="F7F7FA" w:color="auto" w:val="clear"/>
+            <w:tcMar>
+              <w:top w:type="dxa" w:w="50"/>
+              <w:left w:type="dxa" w:w="90"/>
+              <w:bottom w:type="dxa" w:w="50"/>
+              <w:right w:type="dxa" w:w="90"/>
+            </w:tcMar>
+            <w:vAlign w:val="center"/>
+          </w:tcPr>
+          <w:p>
+            <w:pPr>
+              <w:spacing w:after="20" w:before="20" w:line="252"/>
+              <w:jc w:val="right"/>
+            </w:pPr>
+            <w:r>
+              <w:rPr>
+                <w:rFonts w:ascii="Calibri" w:cs="Calibri" w:eastAsia="Calibri" w:hAnsi="Calibri"/>
+                <w:b/>
+                <w:bCs/>
+                <w:sz w:val="18"/>
+                <w:szCs w:val="18"/>
+              </w:rPr>
+              <w:t xml:space="preserve">100 %</w:t>
+            </w:r>
+          </w:p>
+        </w:tc>
+        <w:tc>
+          <w:tcPr>
+            <w:tcW w:type="dxa" w:w="1387"/>
+            <w:tcBorders>
+              <w:top w:val="single" w:color="C8C8D0" w:sz="4"/>
+              <w:left w:val="single" w:color="C8C8D0" w:sz="4"/>
+              <w:bottom w:val="single" w:color="C8C8D0" w:sz="4"/>
+              <w:right w:val="single" w:color="C8C8D0" w:sz="4"/>
+            </w:tcBorders>
+            <w:shd w:fill="F7F7FA" w:color="auto" w:val="clear"/>
+            <w:tcMar>
+              <w:top w:type="dxa" w:w="50"/>
+              <w:left w:type="dxa" w:w="90"/>
+              <w:bottom w:type="dxa" w:w="50"/>
+              <w:right w:type="dxa" w:w="90"/>
+            </w:tcMar>
+            <w:vAlign w:val="center"/>
+          </w:tcPr>
+          <w:p>
+            <w:pPr>
+              <w:spacing w:after="20" w:before="20" w:line="252"/>
+              <w:jc w:val="right"/>
+            </w:pPr>
+            <w:r>
+              <w:rPr>
+                <w:rFonts w:ascii="Calibri" w:cs="Calibri" w:eastAsia="Calibri" w:hAnsi="Calibri"/>
+                <w:b/>
+                <w:bCs/>
+                <w:sz w:val="18"/>
+                <w:szCs w:val="18"/>
+              </w:rPr>
+              <w:t xml:space="preserve">500.000 €</w:t>
+            </w:r>
+          </w:p>
+        </w:tc>
+        <w:tc>
+          <w:tcPr>
+            <w:tcW w:type="dxa" w:w="2558"/>
+            <w:tcBorders>
+              <w:top w:val="single" w:color="C8C8D0" w:sz="4"/>
+              <w:left w:val="single" w:color="C8C8D0" w:sz="4"/>
+              <w:bottom w:val="single" w:color="C8C8D0" w:sz="4"/>
+              <w:right w:val="single" w:color="C8C8D0" w:sz="4"/>
+            </w:tcBorders>
+            <w:shd w:fill="F7F7FA" w:color="auto" w:val="clear"/>
+            <w:tcMar>
+              <w:top w:type="dxa" w:w="50"/>
+              <w:left w:type="dxa" w:w="90"/>
+              <w:bottom w:type="dxa" w:w="50"/>
+              <w:right w:type="dxa" w:w="90"/>
+            </w:tcMar>
+            <w:vAlign w:val="center"/>
+          </w:tcPr>
+          <w:p>
+            <w:pPr>
+              <w:spacing w:after="20" w:before="20" w:line="252"/>
+              <w:jc w:val="left"/>
+            </w:pPr>
+          </w:p>
+        </w:tc>
+      </w:tr>
+    </w:tbl>
+    <w:p>
+      <w:pPr>
+        <w:spacing w:after="100"/>
+      </w:pPr>
+    </w:p>
+    <w:p>
+      <w:pPr>
+        <w:spacing w:after="140" w:line="288"/>
+        <w:jc w:val="both"/>
+      </w:pPr>
+      <w:r>
+        <w:rPr>
+          <w:rFonts w:ascii="Calibri" w:cs="Calibri" w:eastAsia="Calibri" w:hAnsi="Calibri"/>
+          <w:sz w:val="21"/>
+          <w:szCs w:val="21"/>
+        </w:rPr>
+        <w:t xml:space="preserve">Die Runde finanziert die Bruttokosten der ersten 24 Monate vor: Basis 563 T€ (165 + 398, Tabelle 11.3) plus Vision 145 T€ (30 + 115, Tabelle 11.5) = 708 T€. Davon trägt die Runde 475 T€ (ohne Reserve), die übrigen 233 T€ tragen die Umsätze von 606 T€ (Basis 51 + 336 = 387 T€, Vision 27 + 192 = 219 T€). Der Umsatzüberschuss von 373 T€ plus die Reserve von 25 T€ ergeben den Kassenbestand von 398 T€ Ende J2 (Tabelle unten): 500 − 708 + 606 = 398. Freelance-Kosten (40 T€) und Infrastruktur (33 T€) werden vollständig aus Umsätzen bezahlt. Der Posten Recht/Marke/Datenschutz liegt mit 50 T€ um 18 T€ über dem Ansatz in 11.3; bei Bestätigung des Vorschlags wird diese Zeile in 11.3 angepasst, bis dahin deckt die Reserve die Differenz.</w:t>
+      </w:r>
+    </w:p>
+    <w:p>
+      <w:pPr>
+        <w:spacing w:after="140" w:line="288"/>
+        <w:jc w:val="both"/>
+      </w:pPr>
+      <w:r>
+        <w:rPr>
+          <w:rFonts w:ascii="Calibri" w:cs="Calibri" w:eastAsia="Calibri" w:hAnsi="Calibri"/>
+          <w:b/>
+          <w:bCs/>
+          <w:sz w:val="21"/>
+          <w:szCs w:val="21"/>
+        </w:rPr>
+        <w:t xml:space="preserve">Liquidität mit 500 T€ (T€, Jahresendwerte)</w:t>
+      </w:r>
+      <w:r>
+        <w:rPr>
+          <w:rFonts w:ascii="Calibri" w:cs="Calibri" w:eastAsia="Calibri" w:hAnsi="Calibri"/>
+          <w:sz w:val="21"/>
+          <w:szCs w:val="21"/>
+        </w:rPr>
+        <w:t xml:space="preserve"> – Kassenbestand Ende Jahr = Vorjahr + Jahresergebnis aus 11.4 bzw. 11.5:</w:t>
+      </w:r>
+    </w:p>
+    <w:tbl>
+      <w:tblPr>
+        <w:tblW w:type="dxa" w:w="9638"/>
+        <w:tblBorders>
+          <w:top w:val="single" w:color="auto" w:sz="4"/>
+          <w:left w:val="single" w:color="auto" w:sz="4"/>
+          <w:bottom w:val="single" w:color="auto" w:sz="4"/>
+          <w:right w:val="single" w:color="auto" w:sz="4"/>
+          <w:insideH w:val="single" w:color="auto" w:sz="4"/>
+          <w:insideV w:val="single" w:color="auto" w:sz="4"/>
+        </w:tblBorders>
+      </w:tblPr>
+      <w:tblGrid>
+        <w:gridCol w:w="5717"/>
+        <w:gridCol w:w="980"/>
+        <w:gridCol w:w="980"/>
+        <w:gridCol w:w="980"/>
+        <w:gridCol w:w="981"/>
+      </w:tblGrid>
+      <w:tr>
+        <w:trPr>
+          <w:cantSplit/>
+          <w:tblHeader/>
+        </w:trPr>
+        <w:tc>
+          <w:tcPr>
+            <w:tcW w:type="dxa" w:w="5717"/>
+            <w:tcBorders>
+              <w:top w:val="single" w:color="C8C8D0" w:sz="4"/>
+              <w:left w:val="single" w:color="C8C8D0" w:sz="4"/>
+              <w:bottom w:val="single" w:color="C8C8D0" w:sz="4"/>
+              <w:right w:val="single" w:color="C8C8D0" w:sz="4"/>
+            </w:tcBorders>
+            <w:shd w:fill="FCE4EE" w:color="auto" w:val="clear"/>
+            <w:tcMar>
+              <w:top w:type="dxa" w:w="50"/>
+              <w:left w:type="dxa" w:w="90"/>
+              <w:bottom w:type="dxa" w:w="50"/>
+              <w:right w:type="dxa" w:w="90"/>
+            </w:tcMar>
+            <w:vAlign w:val="center"/>
+          </w:tcPr>
+          <w:p>
+            <w:pPr>
+              <w:spacing w:after="20" w:before="20" w:line="252"/>
+              <w:jc w:val="left"/>
+            </w:pPr>
+            <w:r>
+              <w:rPr>
+                <w:rFonts w:ascii="Calibri" w:cs="Calibri" w:eastAsia="Calibri" w:hAnsi="Calibri"/>
+                <w:b/>
+                <w:bCs/>
+                <w:color w:val="0F1115"/>
+                <w:sz w:val="16"/>
+                <w:szCs w:val="16"/>
+              </w:rPr>
+              <w:t xml:space="preserve">Szenario (Ergebnis J1 / J2 / J3)</w:t>
+            </w:r>
+          </w:p>
+        </w:tc>
+        <w:tc>
+          <w:tcPr>
+            <w:tcW w:type="dxa" w:w="980"/>
+            <w:tcBorders>
+              <w:top w:val="single" w:color="C8C8D0" w:sz="4"/>
+              <w:left w:val="single" w:color="C8C8D0" w:sz="4"/>
+              <w:bottom w:val="single" w:color="C8C8D0" w:sz="4"/>
+              <w:right w:val="single" w:color="C8C8D0" w:sz="4"/>
+            </w:tcBorders>
+            <w:shd w:fill="FCE4EE" w:color="auto" w:val="clear"/>
+            <w:tcMar>
+              <w:top w:type="dxa" w:w="50"/>
+              <w:left w:type="dxa" w:w="90"/>
+              <w:bottom w:type="dxa" w:w="50"/>
+              <w:right w:type="dxa" w:w="90"/>
+            </w:tcMar>
+            <w:vAlign w:val="center"/>
+          </w:tcPr>
+          <w:p>
+            <w:pPr>
+              <w:spacing w:after="20" w:before="20" w:line="252"/>
+              <w:jc w:val="left"/>
+            </w:pPr>
+            <w:r>
+              <w:rPr>
+                <w:rFonts w:ascii="Calibri" w:cs="Calibri" w:eastAsia="Calibri" w:hAnsi="Calibri"/>
+                <w:b/>
+                <w:bCs/>
+                <w:color w:val="0F1115"/>
+                <w:sz w:val="16"/>
+                <w:szCs w:val="16"/>
+              </w:rPr>
+              <w:t xml:space="preserve">Start</w:t>
+            </w:r>
+          </w:p>
+        </w:tc>
+        <w:tc>
+          <w:tcPr>
+            <w:tcW w:type="dxa" w:w="980"/>
+            <w:tcBorders>
+              <w:top w:val="single" w:color="C8C8D0" w:sz="4"/>
+              <w:left w:val="single" w:color="C8C8D0" w:sz="4"/>
+              <w:bottom w:val="single" w:color="C8C8D0" w:sz="4"/>
+              <w:right w:val="single" w:color="C8C8D0" w:sz="4"/>
+            </w:tcBorders>
+            <w:shd w:fill="FCE4EE" w:color="auto" w:val="clear"/>
+            <w:tcMar>
+              <w:top w:type="dxa" w:w="50"/>
+              <w:left w:type="dxa" w:w="90"/>
+              <w:bottom w:type="dxa" w:w="50"/>
+              <w:right w:type="dxa" w:w="90"/>
+            </w:tcMar>
+            <w:vAlign w:val="center"/>
+          </w:tcPr>
+          <w:p>
+            <w:pPr>
+              <w:spacing w:after="20" w:before="20" w:line="252"/>
+              <w:jc w:val="left"/>
+            </w:pPr>
+            <w:r>
+              <w:rPr>
+                <w:rFonts w:ascii="Calibri" w:cs="Calibri" w:eastAsia="Calibri" w:hAnsi="Calibri"/>
+                <w:b/>
+                <w:bCs/>
+                <w:color w:val="0F1115"/>
+                <w:sz w:val="16"/>
+                <w:szCs w:val="16"/>
+              </w:rPr>
+              <w:t xml:space="preserve">Ende J1</w:t>
+            </w:r>
+          </w:p>
+        </w:tc>
+        <w:tc>
+          <w:tcPr>
+            <w:tcW w:type="dxa" w:w="980"/>
+            <w:tcBorders>
+              <w:top w:val="single" w:color="C8C8D0" w:sz="4"/>
+              <w:left w:val="single" w:color="C8C8D0" w:sz="4"/>
+              <w:bottom w:val="single" w:color="C8C8D0" w:sz="4"/>
+              <w:right w:val="single" w:color="C8C8D0" w:sz="4"/>
+            </w:tcBorders>
+            <w:shd w:fill="FCE4EE" w:color="auto" w:val="clear"/>
+            <w:tcMar>
+              <w:top w:type="dxa" w:w="50"/>
+              <w:left w:type="dxa" w:w="90"/>
+              <w:bottom w:type="dxa" w:w="50"/>
+              <w:right w:type="dxa" w:w="90"/>
+            </w:tcMar>
+            <w:vAlign w:val="center"/>
+          </w:tcPr>
+          <w:p>
+            <w:pPr>
+              <w:spacing w:after="20" w:before="20" w:line="252"/>
+              <w:jc w:val="left"/>
+            </w:pPr>
+            <w:r>
+              <w:rPr>
+                <w:rFonts w:ascii="Calibri" w:cs="Calibri" w:eastAsia="Calibri" w:hAnsi="Calibri"/>
+                <w:b/>
+                <w:bCs/>
+                <w:color w:val="0F1115"/>
+                <w:sz w:val="16"/>
+                <w:szCs w:val="16"/>
+              </w:rPr>
+              <w:t xml:space="preserve">Ende J2</w:t>
+            </w:r>
+          </w:p>
+        </w:tc>
+        <w:tc>
+          <w:tcPr>
+            <w:tcW w:type="dxa" w:w="981"/>
+            <w:tcBorders>
+              <w:top w:val="single" w:color="C8C8D0" w:sz="4"/>
+              <w:left w:val="single" w:color="C8C8D0" w:sz="4"/>
+              <w:bottom w:val="single" w:color="C8C8D0" w:sz="4"/>
+              <w:right w:val="single" w:color="C8C8D0" w:sz="4"/>
+            </w:tcBorders>
+            <w:shd w:fill="FCE4EE" w:color="auto" w:val="clear"/>
+            <w:tcMar>
+              <w:top w:type="dxa" w:w="50"/>
+              <w:left w:type="dxa" w:w="90"/>
+              <w:bottom w:type="dxa" w:w="50"/>
+              <w:right w:type="dxa" w:w="90"/>
+            </w:tcMar>
+            <w:vAlign w:val="center"/>
+          </w:tcPr>
+          <w:p>
+            <w:pPr>
+              <w:spacing w:after="20" w:before="20" w:line="252"/>
+              <w:jc w:val="left"/>
+            </w:pPr>
+            <w:r>
+              <w:rPr>
+                <w:rFonts w:ascii="Calibri" w:cs="Calibri" w:eastAsia="Calibri" w:hAnsi="Calibri"/>
+                <w:b/>
+                <w:bCs/>
+                <w:color w:val="0F1115"/>
+                <w:sz w:val="16"/>
+                <w:szCs w:val="16"/>
+              </w:rPr>
+              <w:t xml:space="preserve">Ende J3</w:t>
+            </w:r>
+          </w:p>
+        </w:tc>
+      </w:tr>
+      <w:tr>
+        <w:trPr>
+          <w:cantSplit/>
+          <w:tblHeader w:val="off"/>
+        </w:trPr>
+        <w:tc>
+          <w:tcPr>
+            <w:tcW w:type="dxa" w:w="5717"/>
+            <w:tcBorders>
+              <w:top w:val="single" w:color="C8C8D0" w:sz="4"/>
+              <w:left w:val="single" w:color="C8C8D0" w:sz="4"/>
+              <w:bottom w:val="single" w:color="C8C8D0" w:sz="4"/>
+              <w:right w:val="single" w:color="C8C8D0" w:sz="4"/>
+            </w:tcBorders>
+            <w:tcMar>
+              <w:top w:type="dxa" w:w="50"/>
+              <w:left w:type="dxa" w:w="90"/>
+              <w:bottom w:type="dxa" w:w="50"/>
+              <w:right w:type="dxa" w:w="90"/>
+            </w:tcMar>
+            <w:vAlign w:val="center"/>
+          </w:tcPr>
+          <w:p>
+            <w:pPr>
+              <w:spacing w:after="20" w:before="20" w:line="252"/>
+              <w:jc w:val="left"/>
+            </w:pPr>
+            <w:r>
+              <w:rPr>
+                <w:rFonts w:ascii="Calibri" w:cs="Calibri" w:eastAsia="Calibri" w:hAnsi="Calibri"/>
+                <w:sz w:val="16"/>
+                <w:szCs w:val="16"/>
+              </w:rPr>
+              <w:t xml:space="preserve">Konservativ (−105 / −149 / −62)</w:t>
+            </w:r>
+          </w:p>
+        </w:tc>
+        <w:tc>
+          <w:tcPr>
+            <w:tcW w:type="dxa" w:w="980"/>
+            <w:tcBorders>
+              <w:top w:val="single" w:color="C8C8D0" w:sz="4"/>
+              <w:left w:val="single" w:color="C8C8D0" w:sz="4"/>
+              <w:bottom w:val="single" w:color="C8C8D0" w:sz="4"/>
+              <w:right w:val="single" w:color="C8C8D0" w:sz="4"/>
+            </w:tcBorders>
+            <w:tcMar>
+              <w:top w:type="dxa" w:w="50"/>
+              <w:left w:type="dxa" w:w="90"/>
+              <w:bottom w:type="dxa" w:w="50"/>
+              <w:right w:type="dxa" w:w="90"/>
+            </w:tcMar>
+            <w:vAlign w:val="center"/>
+          </w:tcPr>
+          <w:p>
+            <w:pPr>
+              <w:spacing w:after="20" w:before="20" w:line="252"/>
+              <w:jc w:val="right"/>
+            </w:pPr>
+            <w:r>
+              <w:rPr>
+                <w:rFonts w:ascii="Calibri" w:cs="Calibri" w:eastAsia="Calibri" w:hAnsi="Calibri"/>
+                <w:sz w:val="16"/>
+                <w:szCs w:val="16"/>
+              </w:rPr>
+              <w:t xml:space="preserve">500</w:t>
+            </w:r>
+          </w:p>
+        </w:tc>
+        <w:tc>
+          <w:tcPr>
+            <w:tcW w:type="dxa" w:w="980"/>
+            <w:tcBorders>
+              <w:top w:val="single" w:color="C8C8D0" w:sz="4"/>
+              <w:left w:val="single" w:color="C8C8D0" w:sz="4"/>
+              <w:bottom w:val="single" w:color="C8C8D0" w:sz="4"/>
+              <w:right w:val="single" w:color="C8C8D0" w:sz="4"/>
+            </w:tcBorders>
+            <w:tcMar>
+              <w:top w:type="dxa" w:w="50"/>
+              <w:left w:type="dxa" w:w="90"/>
+              <w:bottom w:type="dxa" w:w="50"/>
+              <w:right w:type="dxa" w:w="90"/>
+            </w:tcMar>
+            <w:vAlign w:val="center"/>
+          </w:tcPr>
+          <w:p>
+            <w:pPr>
+              <w:spacing w:after="20" w:before="20" w:line="252"/>
+              <w:jc w:val="right"/>
+            </w:pPr>
+            <w:r>
+              <w:rPr>
+                <w:rFonts w:ascii="Calibri" w:cs="Calibri" w:eastAsia="Calibri" w:hAnsi="Calibri"/>
+                <w:sz w:val="16"/>
+                <w:szCs w:val="16"/>
+              </w:rPr>
+              <w:t xml:space="preserve">395</w:t>
+            </w:r>
+          </w:p>
+        </w:tc>
+        <w:tc>
+          <w:tcPr>
+            <w:tcW w:type="dxa" w:w="980"/>
+            <w:tcBorders>
+              <w:top w:val="single" w:color="C8C8D0" w:sz="4"/>
+              <w:left w:val="single" w:color="C8C8D0" w:sz="4"/>
+              <w:bottom w:val="single" w:color="C8C8D0" w:sz="4"/>
+              <w:right w:val="single" w:color="C8C8D0" w:sz="4"/>
+            </w:tcBorders>
+            <w:tcMar>
+              <w:top w:type="dxa" w:w="50"/>
+              <w:left w:type="dxa" w:w="90"/>
+              <w:bottom w:type="dxa" w:w="50"/>
+              <w:right w:type="dxa" w:w="90"/>
+            </w:tcMar>
+            <w:vAlign w:val="center"/>
+          </w:tcPr>
+          <w:p>
+            <w:pPr>
+              <w:spacing w:after="20" w:before="20" w:line="252"/>
+              <w:jc w:val="right"/>
+            </w:pPr>
+            <w:r>
+              <w:rPr>
+                <w:rFonts w:ascii="Calibri" w:cs="Calibri" w:eastAsia="Calibri" w:hAnsi="Calibri"/>
+                <w:sz w:val="16"/>
+                <w:szCs w:val="16"/>
+              </w:rPr>
+              <w:t xml:space="preserve">246</w:t>
+            </w:r>
+          </w:p>
+        </w:tc>
+        <w:tc>
+          <w:tcPr>
+            <w:tcW w:type="dxa" w:w="981"/>
+            <w:tcBorders>
+              <w:top w:val="single" w:color="C8C8D0" w:sz="4"/>
+              <w:left w:val="single" w:color="C8C8D0" w:sz="4"/>
+              <w:bottom w:val="single" w:color="C8C8D0" w:sz="4"/>
+              <w:right w:val="single" w:color="C8C8D0" w:sz="4"/>
+            </w:tcBorders>
+            <w:tcMar>
+              <w:top w:type="dxa" w:w="50"/>
+              <w:left w:type="dxa" w:w="90"/>
+              <w:bottom w:type="dxa" w:w="50"/>
+              <w:right w:type="dxa" w:w="90"/>
+            </w:tcMar>
+            <w:vAlign w:val="center"/>
+          </w:tcPr>
+          <w:p>
+            <w:pPr>
+              <w:spacing w:after="20" w:before="20" w:line="252"/>
+              <w:jc w:val="right"/>
+            </w:pPr>
+            <w:r>
+              <w:rPr>
+                <w:rFonts w:ascii="Calibri" w:cs="Calibri" w:eastAsia="Calibri" w:hAnsi="Calibri"/>
+                <w:sz w:val="16"/>
+                <w:szCs w:val="16"/>
+              </w:rPr>
+              <w:t xml:space="preserve">184</w:t>
+            </w:r>
+          </w:p>
+        </w:tc>
+      </w:tr>
+      <w:tr>
+        <w:trPr>
+          <w:cantSplit/>
+          <w:tblHeader w:val="off"/>
+        </w:trPr>
+        <w:tc>
+          <w:tcPr>
+            <w:tcW w:type="dxa" w:w="5717"/>
+            <w:tcBorders>
+              <w:top w:val="single" w:color="C8C8D0" w:sz="4"/>
+              <w:left w:val="single" w:color="C8C8D0" w:sz="4"/>
+              <w:bottom w:val="single" w:color="C8C8D0" w:sz="4"/>
+              <w:right w:val="single" w:color="C8C8D0" w:sz="4"/>
+            </w:tcBorders>
+            <w:shd w:fill="F7F7FA" w:color="auto" w:val="clear"/>
+            <w:tcMar>
+              <w:top w:type="dxa" w:w="50"/>
+              <w:left w:type="dxa" w:w="90"/>
+              <w:bottom w:type="dxa" w:w="50"/>
+              <w:right w:type="dxa" w:w="90"/>
+            </w:tcMar>
+            <w:vAlign w:val="center"/>
+          </w:tcPr>
+          <w:p>
+            <w:pPr>
+              <w:spacing w:after="20" w:before="20" w:line="252"/>
+              <w:jc w:val="left"/>
+            </w:pPr>
+            <w:r>
+              <w:rPr>
+                <w:rFonts w:ascii="Calibri" w:cs="Calibri" w:eastAsia="Calibri" w:hAnsi="Calibri"/>
+                <w:b/>
+                <w:bCs/>
+                <w:sz w:val="16"/>
+                <w:szCs w:val="16"/>
+              </w:rPr>
+              <w:t xml:space="preserve">Basis (−114 / −62 / +329)</w:t>
+            </w:r>
+          </w:p>
+        </w:tc>
+        <w:tc>
+          <w:tcPr>
+            <w:tcW w:type="dxa" w:w="980"/>
+            <w:tcBorders>
+              <w:top w:val="single" w:color="C8C8D0" w:sz="4"/>
+              <w:left w:val="single" w:color="C8C8D0" w:sz="4"/>
+              <w:bottom w:val="single" w:color="C8C8D0" w:sz="4"/>
+              <w:right w:val="single" w:color="C8C8D0" w:sz="4"/>
+            </w:tcBorders>
+            <w:shd w:fill="F7F7FA" w:color="auto" w:val="clear"/>
+            <w:tcMar>
+              <w:top w:type="dxa" w:w="50"/>
+              <w:left w:type="dxa" w:w="90"/>
+              <w:bottom w:type="dxa" w:w="50"/>
+              <w:right w:type="dxa" w:w="90"/>
+            </w:tcMar>
+            <w:vAlign w:val="center"/>
+          </w:tcPr>
+          <w:p>
+            <w:pPr>
+              <w:spacing w:after="20" w:before="20" w:line="252"/>
+              <w:jc w:val="right"/>
+            </w:pPr>
+            <w:r>
+              <w:rPr>
+                <w:rFonts w:ascii="Calibri" w:cs="Calibri" w:eastAsia="Calibri" w:hAnsi="Calibri"/>
+                <w:b/>
+                <w:bCs/>
+                <w:sz w:val="16"/>
+                <w:szCs w:val="16"/>
+              </w:rPr>
+              <w:t xml:space="preserve">500</w:t>
+            </w:r>
+          </w:p>
+        </w:tc>
+        <w:tc>
+          <w:tcPr>
+            <w:tcW w:type="dxa" w:w="980"/>
+            <w:tcBorders>
+              <w:top w:val="single" w:color="C8C8D0" w:sz="4"/>
+              <w:left w:val="single" w:color="C8C8D0" w:sz="4"/>
+              <w:bottom w:val="single" w:color="C8C8D0" w:sz="4"/>
+              <w:right w:val="single" w:color="C8C8D0" w:sz="4"/>
+            </w:tcBorders>
+            <w:shd w:fill="F7F7FA" w:color="auto" w:val="clear"/>
+            <w:tcMar>
+              <w:top w:type="dxa" w:w="50"/>
+              <w:left w:type="dxa" w:w="90"/>
+              <w:bottom w:type="dxa" w:w="50"/>
+              <w:right w:type="dxa" w:w="90"/>
+            </w:tcMar>
+            <w:vAlign w:val="center"/>
+          </w:tcPr>
+          <w:p>
+            <w:pPr>
+              <w:spacing w:after="20" w:before="20" w:line="252"/>
+              <w:jc w:val="right"/>
+            </w:pPr>
+            <w:r>
+              <w:rPr>
+                <w:rFonts w:ascii="Calibri" w:cs="Calibri" w:eastAsia="Calibri" w:hAnsi="Calibri"/>
+                <w:b/>
+                <w:bCs/>
+                <w:sz w:val="16"/>
+                <w:szCs w:val="16"/>
+              </w:rPr>
+              <w:t xml:space="preserve">386</w:t>
+            </w:r>
+          </w:p>
+        </w:tc>
+        <w:tc>
+          <w:tcPr>
+            <w:tcW w:type="dxa" w:w="980"/>
+            <w:tcBorders>
+              <w:top w:val="single" w:color="C8C8D0" w:sz="4"/>
+              <w:left w:val="single" w:color="C8C8D0" w:sz="4"/>
+              <w:bottom w:val="single" w:color="C8C8D0" w:sz="4"/>
+              <w:right w:val="single" w:color="C8C8D0" w:sz="4"/>
+            </w:tcBorders>
+            <w:shd w:fill="F7F7FA" w:color="auto" w:val="clear"/>
+            <w:tcMar>
+              <w:top w:type="dxa" w:w="50"/>
+              <w:left w:type="dxa" w:w="90"/>
+              <w:bottom w:type="dxa" w:w="50"/>
+              <w:right w:type="dxa" w:w="90"/>
+            </w:tcMar>
+            <w:vAlign w:val="center"/>
+          </w:tcPr>
+          <w:p>
+            <w:pPr>
+              <w:spacing w:after="20" w:before="20" w:line="252"/>
+              <w:jc w:val="right"/>
+            </w:pPr>
+            <w:r>
+              <w:rPr>
+                <w:rFonts w:ascii="Calibri" w:cs="Calibri" w:eastAsia="Calibri" w:hAnsi="Calibri"/>
+                <w:b/>
+                <w:bCs/>
+                <w:sz w:val="16"/>
+                <w:szCs w:val="16"/>
+              </w:rPr>
+              <w:t xml:space="preserve">324</w:t>
+            </w:r>
+          </w:p>
+        </w:tc>
+        <w:tc>
+          <w:tcPr>
+            <w:tcW w:type="dxa" w:w="981"/>
+            <w:tcBorders>
+              <w:top w:val="single" w:color="C8C8D0" w:sz="4"/>
+              <w:left w:val="single" w:color="C8C8D0" w:sz="4"/>
+              <w:bottom w:val="single" w:color="C8C8D0" w:sz="4"/>
+              <w:right w:val="single" w:color="C8C8D0" w:sz="4"/>
+            </w:tcBorders>
+            <w:shd w:fill="F7F7FA" w:color="auto" w:val="clear"/>
+            <w:tcMar>
+              <w:top w:type="dxa" w:w="50"/>
+              <w:left w:type="dxa" w:w="90"/>
+              <w:bottom w:type="dxa" w:w="50"/>
+              <w:right w:type="dxa" w:w="90"/>
+            </w:tcMar>
+            <w:vAlign w:val="center"/>
+          </w:tcPr>
+          <w:p>
+            <w:pPr>
+              <w:spacing w:after="20" w:before="20" w:line="252"/>
+              <w:jc w:val="right"/>
+            </w:pPr>
+            <w:r>
+              <w:rPr>
+                <w:rFonts w:ascii="Calibri" w:cs="Calibri" w:eastAsia="Calibri" w:hAnsi="Calibri"/>
+                <w:b/>
+                <w:bCs/>
+                <w:sz w:val="16"/>
+                <w:szCs w:val="16"/>
+              </w:rPr>
+              <w:t xml:space="preserve">653</w:t>
+            </w:r>
+          </w:p>
+        </w:tc>
+      </w:tr>
+      <w:tr>
+        <w:trPr>
+          <w:cantSplit/>
+          <w:tblHeader w:val="off"/>
+        </w:trPr>
+        <w:tc>
+          <w:tcPr>
+            <w:tcW w:type="dxa" w:w="5717"/>
+            <w:tcBorders>
+              <w:top w:val="single" w:color="C8C8D0" w:sz="4"/>
+              <w:left w:val="single" w:color="C8C8D0" w:sz="4"/>
+              <w:bottom w:val="single" w:color="C8C8D0" w:sz="4"/>
+              <w:right w:val="single" w:color="C8C8D0" w:sz="4"/>
+            </w:tcBorders>
+            <w:tcMar>
+              <w:top w:type="dxa" w:w="50"/>
+              <w:left w:type="dxa" w:w="90"/>
+              <w:bottom w:type="dxa" w:w="50"/>
+              <w:right w:type="dxa" w:w="90"/>
+            </w:tcMar>
+            <w:vAlign w:val="center"/>
+          </w:tcPr>
+          <w:p>
+            <w:pPr>
+              <w:spacing w:after="20" w:before="20" w:line="252"/>
+              <w:jc w:val="left"/>
+            </w:pPr>
+            <w:r>
+              <w:rPr>
+                <w:rFonts w:ascii="Calibri" w:cs="Calibri" w:eastAsia="Calibri" w:hAnsi="Calibri"/>
+                <w:sz w:val="16"/>
+                <w:szCs w:val="16"/>
+              </w:rPr>
+              <w:t xml:space="preserve">Basis inkl. Vision (−117 / +15 / +736)</w:t>
+            </w:r>
+          </w:p>
+        </w:tc>
+        <w:tc>
+          <w:tcPr>
+            <w:tcW w:type="dxa" w:w="980"/>
+            <w:tcBorders>
+              <w:top w:val="single" w:color="C8C8D0" w:sz="4"/>
+              <w:left w:val="single" w:color="C8C8D0" w:sz="4"/>
+              <w:bottom w:val="single" w:color="C8C8D0" w:sz="4"/>
+              <w:right w:val="single" w:color="C8C8D0" w:sz="4"/>
+            </w:tcBorders>
+            <w:tcMar>
+              <w:top w:type="dxa" w:w="50"/>
+              <w:left w:type="dxa" w:w="90"/>
+              <w:bottom w:type="dxa" w:w="50"/>
+              <w:right w:type="dxa" w:w="90"/>
+            </w:tcMar>
+            <w:vAlign w:val="center"/>
+          </w:tcPr>
+          <w:p>
+            <w:pPr>
+              <w:spacing w:after="20" w:before="20" w:line="252"/>
+              <w:jc w:val="right"/>
+            </w:pPr>
+            <w:r>
+              <w:rPr>
+                <w:rFonts w:ascii="Calibri" w:cs="Calibri" w:eastAsia="Calibri" w:hAnsi="Calibri"/>
+                <w:sz w:val="16"/>
+                <w:szCs w:val="16"/>
+              </w:rPr>
+              <w:t xml:space="preserve">500</w:t>
+            </w:r>
+          </w:p>
+        </w:tc>
+        <w:tc>
+          <w:tcPr>
+            <w:tcW w:type="dxa" w:w="980"/>
+            <w:tcBorders>
+              <w:top w:val="single" w:color="C8C8D0" w:sz="4"/>
+              <w:left w:val="single" w:color="C8C8D0" w:sz="4"/>
+              <w:bottom w:val="single" w:color="C8C8D0" w:sz="4"/>
+              <w:right w:val="single" w:color="C8C8D0" w:sz="4"/>
+            </w:tcBorders>
+            <w:tcMar>
+              <w:top w:type="dxa" w:w="50"/>
+              <w:left w:type="dxa" w:w="90"/>
+              <w:bottom w:type="dxa" w:w="50"/>
+              <w:right w:type="dxa" w:w="90"/>
+            </w:tcMar>
+            <w:vAlign w:val="center"/>
+          </w:tcPr>
+          <w:p>
+            <w:pPr>
+              <w:spacing w:after="20" w:before="20" w:line="252"/>
+              <w:jc w:val="right"/>
+            </w:pPr>
+            <w:r>
+              <w:rPr>
+                <w:rFonts w:ascii="Calibri" w:cs="Calibri" w:eastAsia="Calibri" w:hAnsi="Calibri"/>
+                <w:sz w:val="16"/>
+                <w:szCs w:val="16"/>
+              </w:rPr>
+              <w:t xml:space="preserve">383</w:t>
+            </w:r>
+          </w:p>
+        </w:tc>
+        <w:tc>
+          <w:tcPr>
+            <w:tcW w:type="dxa" w:w="980"/>
+            <w:tcBorders>
+              <w:top w:val="single" w:color="C8C8D0" w:sz="4"/>
+              <w:left w:val="single" w:color="C8C8D0" w:sz="4"/>
+              <w:bottom w:val="single" w:color="C8C8D0" w:sz="4"/>
+              <w:right w:val="single" w:color="C8C8D0" w:sz="4"/>
+            </w:tcBorders>
+            <w:tcMar>
+              <w:top w:type="dxa" w:w="50"/>
+              <w:left w:type="dxa" w:w="90"/>
+              <w:bottom w:type="dxa" w:w="50"/>
+              <w:right w:type="dxa" w:w="90"/>
+            </w:tcMar>
+            <w:vAlign w:val="center"/>
+          </w:tcPr>
+          <w:p>
+            <w:pPr>
+              <w:spacing w:after="20" w:before="20" w:line="252"/>
+              <w:jc w:val="right"/>
+            </w:pPr>
+            <w:r>
+              <w:rPr>
+                <w:rFonts w:ascii="Calibri" w:cs="Calibri" w:eastAsia="Calibri" w:hAnsi="Calibri"/>
+                <w:sz w:val="16"/>
+                <w:szCs w:val="16"/>
+              </w:rPr>
+              <w:t xml:space="preserve">398</w:t>
+            </w:r>
+          </w:p>
+        </w:tc>
+        <w:tc>
+          <w:tcPr>
+            <w:tcW w:type="dxa" w:w="981"/>
+            <w:tcBorders>
+              <w:top w:val="single" w:color="C8C8D0" w:sz="4"/>
+              <w:left w:val="single" w:color="C8C8D0" w:sz="4"/>
+              <w:bottom w:val="single" w:color="C8C8D0" w:sz="4"/>
+              <w:right w:val="single" w:color="C8C8D0" w:sz="4"/>
+            </w:tcBorders>
+            <w:tcMar>
+              <w:top w:type="dxa" w:w="50"/>
+              <w:left w:type="dxa" w:w="90"/>
+              <w:bottom w:type="dxa" w:w="50"/>
+              <w:right w:type="dxa" w:w="90"/>
+            </w:tcMar>
+            <w:vAlign w:val="center"/>
+          </w:tcPr>
+          <w:p>
+            <w:pPr>
+              <w:spacing w:after="20" w:before="20" w:line="252"/>
+              <w:jc w:val="right"/>
+            </w:pPr>
+            <w:r>
+              <w:rPr>
+                <w:rFonts w:ascii="Calibri" w:cs="Calibri" w:eastAsia="Calibri" w:hAnsi="Calibri"/>
+                <w:sz w:val="16"/>
+                <w:szCs w:val="16"/>
+              </w:rPr>
+              <w:t xml:space="preserve">1.134</w:t>
+            </w:r>
+          </w:p>
+        </w:tc>
+      </w:tr>
+      <w:tr>
+        <w:trPr>
+          <w:cantSplit/>
+          <w:tblHeader w:val="off"/>
+        </w:trPr>
+        <w:tc>
+          <w:tcPr>
+            <w:tcW w:type="dxa" w:w="5717"/>
+            <w:tcBorders>
+              <w:top w:val="single" w:color="C8C8D0" w:sz="4"/>
+              <w:left w:val="single" w:color="C8C8D0" w:sz="4"/>
+              <w:bottom w:val="single" w:color="C8C8D0" w:sz="4"/>
+              <w:right w:val="single" w:color="C8C8D0" w:sz="4"/>
+            </w:tcBorders>
+            <w:shd w:fill="F7F7FA" w:color="auto" w:val="clear"/>
+            <w:tcMar>
+              <w:top w:type="dxa" w:w="50"/>
+              <w:left w:type="dxa" w:w="90"/>
+              <w:bottom w:type="dxa" w:w="50"/>
+              <w:right w:type="dxa" w:w="90"/>
+            </w:tcMar>
+            <w:vAlign w:val="center"/>
+          </w:tcPr>
+          <w:p>
+            <w:pPr>
+              <w:spacing w:after="20" w:before="20" w:line="252"/>
+              <w:jc w:val="left"/>
+            </w:pPr>
+            <w:r>
+              <w:rPr>
+                <w:rFonts w:ascii="Calibri" w:cs="Calibri" w:eastAsia="Calibri" w:hAnsi="Calibri"/>
+                <w:sz w:val="16"/>
+                <w:szCs w:val="16"/>
+              </w:rPr>
+              <w:t xml:space="preserve">Optimistisch (−66 / +373 / +1.501)</w:t>
+            </w:r>
+          </w:p>
+        </w:tc>
+        <w:tc>
+          <w:tcPr>
+            <w:tcW w:type="dxa" w:w="980"/>
+            <w:tcBorders>
+              <w:top w:val="single" w:color="C8C8D0" w:sz="4"/>
+              <w:left w:val="single" w:color="C8C8D0" w:sz="4"/>
+              <w:bottom w:val="single" w:color="C8C8D0" w:sz="4"/>
+              <w:right w:val="single" w:color="C8C8D0" w:sz="4"/>
+            </w:tcBorders>
+            <w:shd w:fill="F7F7FA" w:color="auto" w:val="clear"/>
+            <w:tcMar>
+              <w:top w:type="dxa" w:w="50"/>
+              <w:left w:type="dxa" w:w="90"/>
+              <w:bottom w:type="dxa" w:w="50"/>
+              <w:right w:type="dxa" w:w="90"/>
+            </w:tcMar>
+            <w:vAlign w:val="center"/>
+          </w:tcPr>
+          <w:p>
+            <w:pPr>
+              <w:spacing w:after="20" w:before="20" w:line="252"/>
+              <w:jc w:val="right"/>
+            </w:pPr>
+            <w:r>
+              <w:rPr>
+                <w:rFonts w:ascii="Calibri" w:cs="Calibri" w:eastAsia="Calibri" w:hAnsi="Calibri"/>
+                <w:sz w:val="16"/>
+                <w:szCs w:val="16"/>
+              </w:rPr>
+              <w:t xml:space="preserve">500</w:t>
+            </w:r>
+          </w:p>
+        </w:tc>
+        <w:tc>
+          <w:tcPr>
+            <w:tcW w:type="dxa" w:w="980"/>
+            <w:tcBorders>
+              <w:top w:val="single" w:color="C8C8D0" w:sz="4"/>
+              <w:left w:val="single" w:color="C8C8D0" w:sz="4"/>
+              <w:bottom w:val="single" w:color="C8C8D0" w:sz="4"/>
+              <w:right w:val="single" w:color="C8C8D0" w:sz="4"/>
+            </w:tcBorders>
+            <w:shd w:fill="F7F7FA" w:color="auto" w:val="clear"/>
+            <w:tcMar>
+              <w:top w:type="dxa" w:w="50"/>
+              <w:left w:type="dxa" w:w="90"/>
+              <w:bottom w:type="dxa" w:w="50"/>
+              <w:right w:type="dxa" w:w="90"/>
+            </w:tcMar>
+            <w:vAlign w:val="center"/>
+          </w:tcPr>
+          <w:p>
+            <w:pPr>
+              <w:spacing w:after="20" w:before="20" w:line="252"/>
+              <w:jc w:val="right"/>
+            </w:pPr>
+            <w:r>
+              <w:rPr>
+                <w:rFonts w:ascii="Calibri" w:cs="Calibri" w:eastAsia="Calibri" w:hAnsi="Calibri"/>
+                <w:sz w:val="16"/>
+                <w:szCs w:val="16"/>
+              </w:rPr>
+              <w:t xml:space="preserve">434</w:t>
+            </w:r>
+          </w:p>
+        </w:tc>
+        <w:tc>
+          <w:tcPr>
+            <w:tcW w:type="dxa" w:w="980"/>
+            <w:tcBorders>
+              <w:top w:val="single" w:color="C8C8D0" w:sz="4"/>
+              <w:left w:val="single" w:color="C8C8D0" w:sz="4"/>
+              <w:bottom w:val="single" w:color="C8C8D0" w:sz="4"/>
+              <w:right w:val="single" w:color="C8C8D0" w:sz="4"/>
+            </w:tcBorders>
+            <w:shd w:fill="F7F7FA" w:color="auto" w:val="clear"/>
+            <w:tcMar>
+              <w:top w:type="dxa" w:w="50"/>
+              <w:left w:type="dxa" w:w="90"/>
+              <w:bottom w:type="dxa" w:w="50"/>
+              <w:right w:type="dxa" w:w="90"/>
+            </w:tcMar>
+            <w:vAlign w:val="center"/>
+          </w:tcPr>
+          <w:p>
+            <w:pPr>
+              <w:spacing w:after="20" w:before="20" w:line="252"/>
+              <w:jc w:val="right"/>
+            </w:pPr>
+            <w:r>
+              <w:rPr>
+                <w:rFonts w:ascii="Calibri" w:cs="Calibri" w:eastAsia="Calibri" w:hAnsi="Calibri"/>
+                <w:sz w:val="16"/>
+                <w:szCs w:val="16"/>
+              </w:rPr>
+              <w:t xml:space="preserve">807</w:t>
+            </w:r>
+          </w:p>
+        </w:tc>
+        <w:tc>
+          <w:tcPr>
+            <w:tcW w:type="dxa" w:w="981"/>
+            <w:tcBorders>
+              <w:top w:val="single" w:color="C8C8D0" w:sz="4"/>
+              <w:left w:val="single" w:color="C8C8D0" w:sz="4"/>
+              <w:bottom w:val="single" w:color="C8C8D0" w:sz="4"/>
+              <w:right w:val="single" w:color="C8C8D0" w:sz="4"/>
+            </w:tcBorders>
+            <w:shd w:fill="F7F7FA" w:color="auto" w:val="clear"/>
+            <w:tcMar>
+              <w:top w:type="dxa" w:w="50"/>
+              <w:left w:type="dxa" w:w="90"/>
+              <w:bottom w:type="dxa" w:w="50"/>
+              <w:right w:type="dxa" w:w="90"/>
+            </w:tcMar>
+            <w:vAlign w:val="center"/>
+          </w:tcPr>
+          <w:p>
+            <w:pPr>
+              <w:spacing w:after="20" w:before="20" w:line="252"/>
+              <w:jc w:val="right"/>
+            </w:pPr>
+            <w:r>
+              <w:rPr>
+                <w:rFonts w:ascii="Calibri" w:cs="Calibri" w:eastAsia="Calibri" w:hAnsi="Calibri"/>
+                <w:sz w:val="16"/>
+                <w:szCs w:val="16"/>
+              </w:rPr>
+              <w:t xml:space="preserve">2.308</w:t>
+            </w:r>
+          </w:p>
+        </w:tc>
+      </w:tr>
+    </w:tbl>
+    <w:p>
+      <w:pPr>
+        <w:spacing w:after="100"/>
+      </w:pPr>
+    </w:p>
+    <w:p>
+      <w:pPr>
+        <w:spacing w:after="140" w:line="288"/>
+        <w:jc w:val="both"/>
+      </w:pPr>
+      <w:r>
+        <w:rPr>
+          <w:rFonts w:ascii="Calibri" w:cs="Calibri" w:eastAsia="Calibri" w:hAnsi="Calibri"/>
+          <w:sz w:val="21"/>
+          <w:szCs w:val="21"/>
+        </w:rPr>
+        <w:t xml:space="preserve">Rechenbeispiel Basis: 500 − 114 = 386; 386 − 62 = 324; 324 + 329 = 653. Kontrolle: 500 + kumuliertes Ergebnis +153 (11.4) = 653.</w:t>
+      </w:r>
+    </w:p>
+    <w:p>
+      <w:pPr>
+        <w:spacing w:after="140" w:line="288"/>
+        <w:jc w:val="both"/>
+      </w:pPr>
+      <w:r>
+        <w:rPr>
+          <w:rFonts w:ascii="Calibri" w:cs="Calibri" w:eastAsia="Calibri" w:hAnsi="Calibri"/>
+          <w:b/>
+          <w:bCs/>
+          <w:sz w:val="21"/>
+          <w:szCs w:val="21"/>
+        </w:rPr>
+        <w:t xml:space="preserve">Reichweite (Runway):</w:t>
+      </w:r>
+    </w:p>
+    <w:p>
+      <w:pPr>
+        <w:pStyle w:val="ListParagraph"/>
+        <w:numPr>
+          <w:ilvl w:val="0"/>
+          <w:numId w:val="2"/>
+        </w:numPr>
+        <w:spacing w:after="70" w:line="276"/>
+      </w:pPr>
+      <w:r>
+        <w:rPr>
+          <w:rFonts w:ascii="Calibri" w:cs="Calibri" w:eastAsia="Calibri" w:hAnsi="Calibri"/>
+          <w:b/>
+          <w:bCs/>
+          <w:sz w:val="21"/>
+          <w:szCs w:val="21"/>
+        </w:rPr>
+        <w:t xml:space="preserve">Ohne jeden Umsatz</w:t>
+      </w:r>
+      <w:r>
+        <w:rPr>
+          <w:rFonts w:ascii="Calibri" w:cs="Calibri" w:eastAsia="Calibri" w:hAnsi="Calibri"/>
+          <w:sz w:val="21"/>
+          <w:szCs w:val="21"/>
+        </w:rPr>
+        <w:t xml:space="preserve"> trägt die Runde die Basis-Kosten aus 11.3 rund </w:t>
+      </w:r>
+      <w:r>
+        <w:rPr>
+          <w:rFonts w:ascii="Calibri" w:cs="Calibri" w:eastAsia="Calibri" w:hAnsi="Calibri"/>
+          <w:b/>
+          <w:bCs/>
+          <w:sz w:val="21"/>
+          <w:szCs w:val="21"/>
+        </w:rPr>
+        <w:t xml:space="preserve">22 Monate</w:t>
+      </w:r>
+      <w:r>
+        <w:rPr>
+          <w:rFonts w:ascii="Calibri" w:cs="Calibri" w:eastAsia="Calibri" w:hAnsi="Calibri"/>
+          <w:sz w:val="21"/>
+          <w:szCs w:val="21"/>
+        </w:rPr>
+        <w:t xml:space="preserve">: J1 kostet 165 T€ (Rest 335 T€), J2 kostet 398 T€, also ≈ 33 T€ pro Monat; 335 ÷ 33 ≈ 10 Monate; 12 + 10 = 22 Monate. Mit den Vision-Kosten aus 11.5 (J1 30 T€, J2 115 T€) sind es rund 19 Monate (500 − 195 = 305; 305 ÷ 43 ≈ 7 Monate).</w:t>
+      </w:r>
+    </w:p>
+    <w:p>
+      <w:pPr>
+        <w:pStyle w:val="ListParagraph"/>
+        <w:numPr>
+          <w:ilvl w:val="0"/>
+          <w:numId w:val="2"/>
+        </w:numPr>
+        <w:spacing w:after="70" w:line="276"/>
+      </w:pPr>
+      <w:r>
+        <w:rPr>
+          <w:rFonts w:ascii="Calibri" w:cs="Calibri" w:eastAsia="Calibri" w:hAnsi="Calibri"/>
+          <w:b/>
+          <w:bCs/>
+          <w:sz w:val="21"/>
+          <w:szCs w:val="21"/>
+        </w:rPr>
+        <w:t xml:space="preserve">Konservativ</w:t>
+      </w:r>
+      <w:r>
+        <w:rPr>
+          <w:rFonts w:ascii="Calibri" w:cs="Calibri" w:eastAsia="Calibri" w:hAnsi="Calibri"/>
+          <w:sz w:val="21"/>
+          <w:szCs w:val="21"/>
+        </w:rPr>
+        <w:t xml:space="preserve"> reicht die Runde über alle drei Jahre (kumuliert −316 T€) und lässt 184 T€ Puffer.</w:t>
+      </w:r>
+    </w:p>
+    <w:p>
+      <w:pPr>
+        <w:pStyle w:val="ListParagraph"/>
+        <w:numPr>
+          <w:ilvl w:val="0"/>
+          <w:numId w:val="2"/>
+        </w:numPr>
+        <w:spacing w:after="70" w:line="276"/>
+      </w:pPr>
+      <w:r>
+        <w:rPr>
+          <w:rFonts w:ascii="Calibri" w:cs="Calibri" w:eastAsia="Calibri" w:hAnsi="Calibri"/>
+          <w:b/>
+          <w:bCs/>
+          <w:sz w:val="21"/>
+          <w:szCs w:val="21"/>
+        </w:rPr>
+        <w:t xml:space="preserve">Basis:</w:t>
+      </w:r>
+      <w:r>
+        <w:rPr>
+          <w:rFonts w:ascii="Calibri" w:cs="Calibri" w:eastAsia="Calibri" w:hAnsi="Calibri"/>
+          <w:sz w:val="21"/>
+          <w:szCs w:val="21"/>
+        </w:rPr>
+        <w:t xml:space="preserve"> Der niedrigste Jahresendstand ist 324 T€ (Ende J2), der Break-even liegt in J3 (mit Vision in J2). Der Puffer sichert Verzögerungen bei Plattform-Pilot und Bildungsvertrieb ab und dient als Brücke zur Seed-Runde.</w:t>
+      </w:r>
+    </w:p>
+    <w:p>
+      <w:pPr>
+        <w:spacing w:after="60"/>
+      </w:pPr>
+    </w:p>
+    <w:p>
+      <w:pPr>
+        <w:spacing w:after="140" w:line="288"/>
+        <w:jc w:val="both"/>
+      </w:pPr>
+      <w:r>
+        <w:rPr>
+          <w:rFonts w:ascii="Calibri" w:cs="Calibri" w:eastAsia="Calibri" w:hAnsi="Calibri"/>
+          <w:sz w:val="21"/>
+          <w:szCs w:val="21"/>
+        </w:rPr>
+        <w:t xml:space="preserve">Alternative, falls die Runde nicht zustande kommt: Bootstrapping – Pro-Abo und Packs finanzieren eine:n Entwickler:in in Teilzeit, das Wachstum verlangsamt sich entsprechend (ungefähr konservatives Szenario). Förderprogramme (EXIST, Gründungsstipendien, Medien-/Edtech-Förderung) werden parallel geprüft.</w:t>
+      </w:r>
+    </w:p>
+    <w:p>
+      <w:pPr>
+        <w:spacing w:after="140" w:line="288"/>
+        <w:jc w:val="both"/>
+      </w:pPr>
+      <w:r>
+        <w:rPr>
+          <w:rFonts w:ascii="Calibri" w:cs="Calibri" w:eastAsia="Calibri" w:hAnsi="Calibri"/>
+          <w:i/>
+          <w:iCs/>
+          <w:sz w:val="21"/>
+          <w:szCs w:val="21"/>
+        </w:rPr>
+        <w:t xml:space="preserve">Hinweis zur Versionsgeschichte: Frühere Fassungen nannten einen Seed-Bedarf von 250–350 T€ für 18–24 Monate, nur für das Kernprodukt. Die 500 T€ ersetzen diese Angabe und schließen die Vision-Linien ein.</w:t>
       </w:r>
     </w:p>
     <w:p>
@@ -20928,7 +23094,7 @@
           <w:sz w:val="21"/>
           <w:szCs w:val="21"/>
         </w:rPr>
-        <w:t xml:space="preserve">Gründerin [Name].</w:t>
+        <w:t xml:space="preserve">Tuncay Sancak – Gründer &amp; Erfinder, Geschäftsführer.</w:t>
       </w:r>
       <w:r>
         <w:rPr>
@@ -20936,7 +23102,31 @@
           <w:sz w:val="21"/>
           <w:szCs w:val="21"/>
         </w:rPr>
-        <w:t xml:space="preserve"> Autorin einer fünfbändigen Kinderbuchreihe zu Neurodiversität (Türkisch, mit Buch-Trailern), Live-Streamerin, deutsch-türkisch, Produktvision und Community. Nutzt LiveFX in jedem eigenen Stream – Vorlesen mit Story-Modus ist aus der eigenen Praxis entstanden.</w:t>
+        <w:t xml:space="preserve"> Hat LiveFX erfunden und gebaut. Autor und Live-Streamer, deutsch-türkisch; Kinderbuchreihe zu Neurodiversität (Türkisch, mit Buch-Trailern); Produktvision und Community. Nutzt LiveFX in jedem eigenen Stream – Vorlesen mit Story-Modus ist aus der eigenen Praxis entstanden.</w:t>
+      </w:r>
+    </w:p>
+    <w:p>
+      <w:pPr>
+        <w:spacing w:after="140" w:line="288"/>
+        <w:jc w:val="both"/>
+      </w:pPr>
+      <w:r>
+        <w:rPr>
+          <w:rFonts w:ascii="Calibri" w:cs="Calibri" w:eastAsia="Calibri" w:hAnsi="Calibri"/>
+          <w:b/>
+          <w:bCs/>
+          <w:sz w:val="21"/>
+          <w:szCs w:val="21"/>
+        </w:rPr>
+        <w:t xml:space="preserve">Gönül Demet – Investor Relations.</w:t>
+      </w:r>
+      <w:r>
+        <w:rPr>
+          <w:rFonts w:ascii="Calibri" w:cs="Calibri" w:eastAsia="Calibri" w:hAnsi="Calibri"/>
+          <w:sz w:val="21"/>
+          <w:szCs w:val="21"/>
+        </w:rPr>
+        <w:t xml:space="preserve"> Ansprechpartnerin für Investoren und die Pre-Seed-Runde (Kontakt: [E-Mail] · [Telefon]).</w:t>
       </w:r>
     </w:p>
     <w:p>
@@ -23990,7 +26180,7 @@
                 <w:sz w:val="18"/>
                 <w:szCs w:val="18"/>
               </w:rPr>
-              <w:t xml:space="preserve">Marke anmelden, Seed-Gespräche, Beirat ansprechen</w:t>
+              <w:t xml:space="preserve">Marke anmelden, Pre-Seed-Gespräche (500 T€), Beirat ansprechen</w:t>
             </w:r>
           </w:p>
         </w:tc>
@@ -24266,7 +26456,7 @@
                 <w:sz w:val="18"/>
                 <w:szCs w:val="18"/>
               </w:rPr>
-              <w:t xml:space="preserve">Seed abgeschlossen oder Bootstrapping-Pfad bestätigt</w:t>
+              <w:t xml:space="preserve">Pre-Seed (500 T€) abgeschlossen oder Bootstrapping-Pfad bestätigt</w:t>
             </w:r>
           </w:p>
         </w:tc>
@@ -26915,7 +29105,7 @@
           <w:sz w:val="21"/>
           <w:szCs w:val="21"/>
         </w:rPr>
-        <w:t xml:space="preserve">Ein Kind sagt „Apfel“ – es erscheint 🍎, darunter „elma“, klein „der Apfel“ mit farbigem Artikel und Silben, und eine Stimme spricht „elma“. Die Lehrkraft wählt nur „Ich spreche“, „Zeige“ und den Modus (Übersetzen, Lesehilfe, Nachsprechen). Zielgruppen sind Familien, Grundschulen (20,4 % der Schüler:innen unter 16 sprechen zu Hause vorwiegend eine andere Sprache [Quelle 37]; 25 % der Viertklässler:innen liegen unter dem Lese-Mindeststandard [Quelle 39]), DaZ- und Integrationskurse sowie Türkisch als Herkunftssprache (2,65 Mio. Menschen mit Einwanderungsgeschichte aus der Türkei [Quelle 38]). Die Lesehilfe knüpft an die Neurodiversitäts-Bücher der Gründerin an. Preis-Anker ist die ANTON-Schullizenz mit 250–700 € pro Schule und Jahr [Quelle 41]; kostenlose Konkurrenz sind Microsoft Reading Coach [Quelle 42] und Google Read Along [Quelle 43]. Für Schulen erzwingt das Schulprofil Spracherkennung auf dem Gerät (</w:t>
+        <w:t xml:space="preserve">Ein Kind sagt „Apfel“ – es erscheint 🍎, darunter „elma“, klein „der Apfel“ mit farbigem Artikel und Silben, und eine Stimme spricht „elma“. Die Lehrkraft wählt nur „Ich spreche“, „Zeige“ und den Modus (Übersetzen, Lesehilfe, Nachsprechen). Zielgruppen sind Familien, Grundschulen (20,4 % der Schüler:innen unter 16 sprechen zu Hause vorwiegend eine andere Sprache [Quelle 37]; 25 % der Viertklässler:innen liegen unter dem Lese-Mindeststandard [Quelle 39]), DaZ- und Integrationskurse sowie Türkisch als Herkunftssprache (2,65 Mio. Menschen mit Einwanderungsgeschichte aus der Türkei [Quelle 38]). Die Lesehilfe knüpft an die Neurodiversitäts-Bücher des Gründers an. Preis-Anker ist die ANTON-Schullizenz mit 250–700 € pro Schule und Jahr [Quelle 41]; kostenlose Konkurrenz sind Microsoft Reading Coach [Quelle 42] und Google Read Along [Quelle 43]. Für Schulen erzwingt das Schulprofil Spracherkennung auf dem Gerät (</w:t>
       </w:r>
       <w:r>
         <w:rPr>
@@ -27892,7 +30082,7 @@
                 <w:sz w:val="18"/>
                 <w:szCs w:val="18"/>
               </w:rPr>
-              <w:t xml:space="preserve">Schule 300–800 €/Jahr · Kurs 49 €/Lehrkraft/Jahr · Event 19–49 €/Tag bzw. 299 €/Jahr · Verlag [2.000 €] pro Titel und Jahr (Schätzung, von der Gründerin zu prüfen) · SDK nach Vereinbarung</w:t>
+              <w:t xml:space="preserve">Schule 300–800 €/Jahr · Kurs 49 €/Lehrkraft/Jahr · Event 19–49 €/Tag bzw. 299 €/Jahr · Verlag [2.000 €] pro Titel und Jahr (Schätzung, vom Gründer zu prüfen) · SDK nach Vereinbarung</w:t>
             </w:r>
           </w:p>
         </w:tc>
@@ -28620,7 +30810,7 @@
         </w:rPr>
         <w:t xml:space="preserve">market.us – Live Streaming Market Report (Marktgröße, CAGR 26,7 %): </w:t>
       </w:r>
-      <w:hyperlink w:history="1" r:id="rId-wpdlvf2forexvv9bfib_">
+      <w:hyperlink w:history="1" r:id="rIdognkubwiojiesiubfjds8">
         <w:r>
           <w:rPr>
             <w:rFonts w:ascii="Calibri" w:cs="Calibri" w:eastAsia="Calibri" w:hAnsi="Calibri"/>
@@ -28650,7 +30840,7 @@
         </w:rPr>
         <w:t xml:space="preserve">Gyre – Live Streaming Statistics (Marktgröße, TikTok-LIVE-Creator-Wachstum): </w:t>
       </w:r>
-      <w:hyperlink w:history="1" r:id="rIdnxt7gueyrwfjy9uxue1fc">
+      <w:hyperlink w:history="1" r:id="rIdiqgnnubyu44yyxhncdgn4">
         <w:r>
           <w:rPr>
             <w:rFonts w:ascii="Calibri" w:cs="Calibri" w:eastAsia="Calibri" w:hAnsi="Calibri"/>
@@ -28680,7 +30870,7 @@
         </w:rPr>
         <w:t xml:space="preserve">datarefs – Creator Economy Statistics (216 Mrd. USD, Live-Anteil ~14 %): </w:t>
       </w:r>
-      <w:hyperlink w:history="1" r:id="rIdcibft9s9xwbpxicwrzdru">
+      <w:hyperlink w:history="1" r:id="rIdobsxhh7ofgwfpkeimbljn">
         <w:r>
           <w:rPr>
             <w:rFonts w:ascii="Calibri" w:cs="Calibri" w:eastAsia="Calibri" w:hAnsi="Calibri"/>
@@ -28710,7 +30900,7 @@
         </w:rPr>
         <w:t xml:space="preserve">New Market Pitch – Creator Economy Market Size (260 Mrd. USD, CAGR 22 %): </w:t>
       </w:r>
-      <w:hyperlink w:history="1" r:id="rId1ht4mulmxenjzysxptt8k">
+      <w:hyperlink w:history="1" r:id="rIdxr-mu4frbkdpipketb3mt">
         <w:r>
           <w:rPr>
             <w:rFonts w:ascii="Calibri" w:cs="Calibri" w:eastAsia="Calibri" w:hAnsi="Calibri"/>
@@ -28740,7 +30930,7 @@
         </w:rPr>
         <w:t xml:space="preserve">InfluencerFee – TikTok LIVE Gifting Revenue Guide (Geschenkanteil, 500–3.000 USD/Monat, 50 % Creator-Anteil): </w:t>
       </w:r>
-      <w:hyperlink w:history="1" r:id="rIdx05w1aoeltlmnoa9dpiji">
+      <w:hyperlink w:history="1" r:id="rId3mmaoxawcadaqh70usec4">
         <w:r>
           <w:rPr>
             <w:rFonts w:ascii="Calibri" w:cs="Calibri" w:eastAsia="Calibri" w:hAnsi="Calibri"/>
@@ -28770,7 +30960,7 @@
         </w:rPr>
         <w:t xml:space="preserve">Muvi – How to make money on TikTok LIVE (Geschenkanteil ~50 %): </w:t>
       </w:r>
-      <w:hyperlink w:history="1" r:id="rId5g1jibahlm1gl_d5ns8h0">
+      <w:hyperlink w:history="1" r:id="rIdmai5d8l6og5mu8apngb8s">
         <w:r>
           <w:rPr>
             <w:rFonts w:ascii="Calibri" w:cs="Calibri" w:eastAsia="Calibri" w:hAnsi="Calibri"/>
@@ -28800,7 +30990,7 @@
         </w:rPr>
         <w:t xml:space="preserve">TTS Vibes – TikTok LIVE Gift Conversion Rate by Viewer: </w:t>
       </w:r>
-      <w:hyperlink w:history="1" r:id="rIdr0xkyexafqbrtxrxqk9rk">
+      <w:hyperlink w:history="1" r:id="rIdjgju9yml6ldltzde8rjc-">
         <w:r>
           <w:rPr>
             <w:rFonts w:ascii="Calibri" w:cs="Calibri" w:eastAsia="Calibri" w:hAnsi="Calibri"/>
@@ -28830,7 +31020,7 @@
         </w:rPr>
         <w:t xml:space="preserve">Shopify TR – TikTok ne kadar ödeme yapıyor (Jeton-Preise, Kommission): </w:t>
       </w:r>
-      <w:hyperlink w:history="1" r:id="rIdmeeqwgfq4bmw2qnf_x13v">
+      <w:hyperlink w:history="1" r:id="rIdkxhnuqmu1f8zrxb5lgott">
         <w:r>
           <w:rPr>
             <w:rFonts w:ascii="Calibri" w:cs="Calibri" w:eastAsia="Calibri" w:hAnsi="Calibri"/>
@@ -28860,7 +31050,7 @@
         </w:rPr>
         <w:t xml:space="preserve">Juntire – TikTok canlı yayın para kazanma 2026 (Voraussetzungen, Jeton-Preise): </w:t>
       </w:r>
-      <w:hyperlink w:history="1" r:id="rIdo21jywkd1up60ozp6c4n2">
+      <w:hyperlink w:history="1" r:id="rId7z3yenzuswwoio4n-ubzm">
         <w:r>
           <w:rPr>
             <w:rFonts w:ascii="Calibri" w:cs="Calibri" w:eastAsia="Calibri" w:hAnsi="Calibri"/>
@@ -28890,7 +31080,7 @@
         </w:rPr>
         <w:t xml:space="preserve">Milliyet – TikTok jeton ve hediye fiyatları 2025: </w:t>
       </w:r>
-      <w:hyperlink w:history="1" r:id="rIdgxszwvdlhcl07-uxaid6q">
+      <w:hyperlink w:history="1" r:id="rIdidv-fs0is9dnem3mqip77">
         <w:r>
           <w:rPr>
             <w:rFonts w:ascii="Calibri" w:cs="Calibri" w:eastAsia="Calibri" w:hAnsi="Calibri"/>
@@ -28920,7 +31110,7 @@
         </w:rPr>
         <w:t xml:space="preserve">Capterra – Streamlabs (Preise): </w:t>
       </w:r>
-      <w:hyperlink w:history="1" r:id="rIdcuwvu9fgtqvoh9pa8b8c3">
+      <w:hyperlink w:history="1" r:id="rIdtdmavcqynm7ln-ma33mth">
         <w:r>
           <w:rPr>
             <w:rFonts w:ascii="Calibri" w:cs="Calibri" w:eastAsia="Calibri" w:hAnsi="Calibri"/>
@@ -28950,7 +31140,7 @@
         </w:rPr>
         <w:t xml:space="preserve">CreatorStackClub – Streamlabs, StreamYard, Restream (Preise): </w:t>
       </w:r>
-      <w:hyperlink w:history="1" r:id="rIddwjzqyutcbt7qhcltjrtx">
+      <w:hyperlink w:history="1" r:id="rId1kn2jyiezyxrzn7cnolr_">
         <w:r>
           <w:rPr>
             <w:rFonts w:ascii="Calibri" w:cs="Calibri" w:eastAsia="Calibri" w:hAnsi="Calibri"/>
@@ -28980,7 +31170,7 @@
         </w:rPr>
         <w:t xml:space="preserve">ToolChase – Voicemod (Preise, Funktionen): </w:t>
       </w:r>
-      <w:hyperlink w:history="1" r:id="rId1ygvyqbkbicf90w424-f9">
+      <w:hyperlink w:history="1" r:id="rIdbqpeub6p2ph2aol50mhjq">
         <w:r>
           <w:rPr>
             <w:rFonts w:ascii="Calibri" w:cs="Calibri" w:eastAsia="Calibri" w:hAnsi="Calibri"/>
@@ -29010,7 +31200,7 @@
         </w:rPr>
         <w:t xml:space="preserve">BIGVU – How to get a TikTok stream key (1.000 Follower, 18+): </w:t>
       </w:r>
-      <w:hyperlink w:history="1" r:id="rIdgxxhocolqxnak6kvit-_1">
+      <w:hyperlink w:history="1" r:id="rIdcc-44_fzqbhvatrmahhd6">
         <w:r>
           <w:rPr>
             <w:rFonts w:ascii="Calibri" w:cs="Calibri" w:eastAsia="Calibri" w:hAnsi="Calibri"/>
@@ -29040,7 +31230,7 @@
         </w:rPr>
         <w:t xml:space="preserve">SMMNut – TikTok LIVE Studio Guide 2026: </w:t>
       </w:r>
-      <w:hyperlink w:history="1" r:id="rIdcm4teshspgsebdqoc3yub">
+      <w:hyperlink w:history="1" r:id="rIdrivygxe5wjw0bo2lnwylm">
         <w:r>
           <w:rPr>
             <w:rFonts w:ascii="Calibri" w:cs="Calibri" w:eastAsia="Calibri" w:hAnsi="Calibri"/>
@@ -29070,7 +31260,7 @@
         </w:rPr>
         <w:t xml:space="preserve">OBS Versions – OBS TikTok Live Streaming Guide: </w:t>
       </w:r>
-      <w:hyperlink w:history="1" r:id="rIdyw-qeduyg_bhhiaiecxxu">
+      <w:hyperlink w:history="1" r:id="rIdozs_sr1p3uklsqhgvtd_t">
         <w:r>
           <w:rPr>
             <w:rFonts w:ascii="Calibri" w:cs="Calibri" w:eastAsia="Calibri" w:hAnsi="Calibri"/>
@@ -29100,7 +31290,7 @@
         </w:rPr>
         <w:t xml:space="preserve">Instagram – Instagram Live Producer (Desktop-Streaming mit OBS): </w:t>
       </w:r>
-      <w:hyperlink w:history="1" r:id="rIdfhg31by1seihgikerbf__">
+      <w:hyperlink w:history="1" r:id="rIdzctgs5vohje3de2abo7gz">
         <w:r>
           <w:rPr>
             <w:rFonts w:ascii="Calibri" w:cs="Calibri" w:eastAsia="Calibri" w:hAnsi="Calibri"/>
@@ -29130,7 +31320,7 @@
         </w:rPr>
         <w:t xml:space="preserve">StreamYard – Streaming software for Instagram Live: </w:t>
       </w:r>
-      <w:hyperlink w:history="1" r:id="rIddaaz3x44iwwbpavqvs5rl">
+      <w:hyperlink w:history="1" r:id="rIdazakbaqa9u3xfcpha7-f1">
         <w:r>
           <w:rPr>
             <w:rFonts w:ascii="Calibri" w:cs="Calibri" w:eastAsia="Calibri" w:hAnsi="Calibri"/>
@@ -29160,7 +31350,7 @@
         </w:rPr>
         <w:t xml:space="preserve">Börsenverein – Buchmarkt kompakt 2025/2026 (Hörbuch 374 Mio €, +13 %): </w:t>
       </w:r>
-      <w:hyperlink w:history="1" r:id="rIdj4m03arlp4mepjbjh6adq">
+      <w:hyperlink w:history="1" r:id="rId-hqse_iyl20v6iim1m4rq">
         <w:r>
           <w:rPr>
             <w:rFonts w:ascii="Calibri" w:cs="Calibri" w:eastAsia="Calibri" w:hAnsi="Calibri"/>
@@ -29190,7 +31380,7 @@
         </w:rPr>
         <w:t xml:space="preserve">ARD/ZDF-Medienstudie 2025 (Podcast 34 %, 23,8 Mio): </w:t>
       </w:r>
-      <w:hyperlink w:history="1" r:id="rIdmmf87ztrpjftgr4wfqyuv">
+      <w:hyperlink w:history="1" r:id="rIdhsy3mj6z9gw1ujevdaruh">
         <w:r>
           <w:rPr>
             <w:rFonts w:ascii="Calibri" w:cs="Calibri" w:eastAsia="Calibri" w:hAnsi="Calibri"/>
@@ -29220,7 +31410,7 @@
         </w:rPr>
         <w:t xml:space="preserve">TechCrunch – YouTube über 1 Mrd monatliche Podcast-Zuschauer: </w:t>
       </w:r>
-      <w:hyperlink w:history="1" r:id="rIdcohzkdeickbe6i0e9urkk">
+      <w:hyperlink w:history="1" r:id="rIdbrn2izk-yqy_ad53eok1e">
         <w:r>
           <w:rPr>
             <w:rFonts w:ascii="Calibri" w:cs="Calibri" w:eastAsia="Calibri" w:hAnsi="Calibri"/>
@@ -29250,7 +31440,7 @@
         </w:rPr>
         <w:t xml:space="preserve">Stiftung Lesen – Vorlesemonitor 2024: </w:t>
       </w:r>
-      <w:hyperlink w:history="1" r:id="rId4lygqnlgrgizdhncsgafd">
+      <w:hyperlink w:history="1" r:id="rIdfktoxxry1qgnjaxrdf32t">
         <w:r>
           <w:rPr>
             <w:rFonts w:ascii="Calibri" w:cs="Calibri" w:eastAsia="Calibri" w:hAnsi="Calibri"/>
@@ -29280,7 +31470,7 @@
         </w:rPr>
         <w:t xml:space="preserve">Meticulous Research – KI-Videogenerierung und -schnitt 2026–2036: </w:t>
       </w:r>
-      <w:hyperlink w:history="1" r:id="rIdxylpvwl4crrrv_fvs9-n4">
+      <w:hyperlink w:history="1" r:id="rIdy6lbgi0hrnhjfw86dd6bc">
         <w:r>
           <w:rPr>
             <w:rFonts w:ascii="Calibri" w:cs="Calibri" w:eastAsia="Calibri" w:hAnsi="Calibri"/>
@@ -29310,7 +31500,7 @@
         </w:rPr>
         <w:t xml:space="preserve">Google – Gemini API Pricing (Veo 3.1 Lite 0,05 USD/s): </w:t>
       </w:r>
-      <w:hyperlink w:history="1" r:id="rIdpdtbp1awfrv7gp9ioeohr">
+      <w:hyperlink w:history="1" r:id="rIdemay-srl5yd4rgpzkkjtk">
         <w:r>
           <w:rPr>
             <w:rFonts w:ascii="Calibri" w:cs="Calibri" w:eastAsia="Calibri" w:hAnsi="Calibri"/>
@@ -29340,7 +31530,7 @@
         </w:rPr>
         <w:t xml:space="preserve">Veo 3 API Pricing 2026 (bis 0,75 USD/s): </w:t>
       </w:r>
-      <w:hyperlink w:history="1" r:id="rIdpikv5aawd-chdw2bxkhjv">
+      <w:hyperlink w:history="1" r:id="rIdyfjk2hrryn5yyiib47bvg">
         <w:r>
           <w:rPr>
             <w:rFonts w:ascii="Calibri" w:cs="Calibri" w:eastAsia="Calibri" w:hAnsi="Calibri"/>
@@ -29370,7 +31560,7 @@
         </w:rPr>
         <w:t xml:space="preserve">CNBC – Synthesia: Bewertung und ARR: </w:t>
       </w:r>
-      <w:hyperlink w:history="1" r:id="rIdu7ep4vbheu7vj9dibohtu">
+      <w:hyperlink w:history="1" r:id="rId2vcpt6ouskrddzazwcdmw">
         <w:r>
           <w:rPr>
             <w:rFonts w:ascii="Calibri" w:cs="Calibri" w:eastAsia="Calibri" w:hAnsi="Calibri"/>
@@ -29400,7 +31590,7 @@
         </w:rPr>
         <w:t xml:space="preserve">web.dev – WebGPU in allen großen Browsern: </w:t>
       </w:r>
-      <w:hyperlink w:history="1" r:id="rIdnuupy5rvdkhqepmbt5udm">
+      <w:hyperlink w:history="1" r:id="rIddhxshmeytsv9vl4udk7bs">
         <w:r>
           <w:rPr>
             <w:rFonts w:ascii="Calibri" w:cs="Calibri" w:eastAsia="Calibri" w:hAnsi="Calibri"/>
@@ -29447,7 +31637,7 @@
         </w:rPr>
         <w:t xml:space="preserve">): </w:t>
       </w:r>
-      <w:hyperlink w:history="1" r:id="rIdvagm-va7lubfrlr9983gx">
+      <w:hyperlink w:history="1" r:id="rIdu7drtcs-dysa9wfbmwhat">
         <w:r>
           <w:rPr>
             <w:rFonts w:ascii="Calibri" w:cs="Calibri" w:eastAsia="Calibri" w:hAnsi="Calibri"/>
@@ -29477,7 +31667,7 @@
         </w:rPr>
         <w:t xml:space="preserve">MDN – SpeechSynthesis: </w:t>
       </w:r>
-      <w:hyperlink w:history="1" r:id="rIdbwe7njiktbe_qbhqxs34l">
+      <w:hyperlink w:history="1" r:id="rId6tt7pyvqn2dlv8stoj0wh">
         <w:r>
           <w:rPr>
             <w:rFonts w:ascii="Calibri" w:cs="Calibri" w:eastAsia="Calibri" w:hAnsi="Calibri"/>
@@ -29507,7 +31697,7 @@
         </w:rPr>
         <w:t xml:space="preserve">Google Noto Emoji (Apache 2.0): </w:t>
       </w:r>
-      <w:hyperlink w:history="1" r:id="rId4ss1t9dhnslrmwq_qoil5">
+      <w:hyperlink w:history="1" r:id="rIdqbxjbtumohvmr4dap5f9d">
         <w:r>
           <w:rPr>
             <w:rFonts w:ascii="Calibri" w:cs="Calibri" w:eastAsia="Calibri" w:hAnsi="Calibri"/>
@@ -29537,7 +31727,7 @@
         </w:rPr>
         <w:t xml:space="preserve">OpenMoji FAQ (CC BY-SA 4.0): </w:t>
       </w:r>
-      <w:hyperlink w:history="1" r:id="rId2xwlpwcepox_itsjjtfwy">
+      <w:hyperlink w:history="1" r:id="rIdvpeaeyfre0r_auyfovpg2">
         <w:r>
           <w:rPr>
             <w:rFonts w:ascii="Calibri" w:cs="Calibri" w:eastAsia="Calibri" w:hAnsi="Calibri"/>
@@ -29567,7 +31757,7 @@
         </w:rPr>
         <w:t xml:space="preserve">Duolingo – Aktionärsbrief Q2 2026 (SEC): </w:t>
       </w:r>
-      <w:hyperlink w:history="1" r:id="rIdc-ljxp2oozp60ohygkhi5">
+      <w:hyperlink w:history="1" r:id="rIdzj1uv5xa9zcwqezmtyjh8">
         <w:r>
           <w:rPr>
             <w:rFonts w:ascii="Calibri" w:cs="Calibri" w:eastAsia="Calibri" w:hAnsi="Calibri"/>
@@ -29597,7 +31787,7 @@
         </w:rPr>
         <w:t xml:space="preserve">Business of Apps – Language Learning App Market: </w:t>
       </w:r>
-      <w:hyperlink w:history="1" r:id="rId9aqibdasoscehjbylihuj">
+      <w:hyperlink w:history="1" r:id="rId6paiwdz1v0hp6bzkzy-o6">
         <w:r>
           <w:rPr>
             <w:rFonts w:ascii="Calibri" w:cs="Calibri" w:eastAsia="Calibri" w:hAnsi="Calibri"/>
@@ -29627,7 +31817,7 @@
         </w:rPr>
         <w:t xml:space="preserve">Mordor Intelligence – Language Learning Market: </w:t>
       </w:r>
-      <w:hyperlink w:history="1" r:id="rIdfus87ocoq2k72v1_xsq7l">
+      <w:hyperlink w:history="1" r:id="rIdj387o0nhfrr4decopcapg">
         <w:r>
           <w:rPr>
             <w:rFonts w:ascii="Calibri" w:cs="Calibri" w:eastAsia="Calibri" w:hAnsi="Calibri"/>
@@ -29657,7 +31847,7 @@
         </w:rPr>
         <w:t xml:space="preserve">GlobeNewswire – Lingokids 120 Mio USD: </w:t>
       </w:r>
-      <w:hyperlink w:history="1" r:id="rIdyzplk8elv4myg_j1zjpdj">
+      <w:hyperlink w:history="1" r:id="rIdtoaloxo7oagy4gejfq7th">
         <w:r>
           <w:rPr>
             <w:rFonts w:ascii="Calibri" w:cs="Calibri" w:eastAsia="Calibri" w:hAnsi="Calibri"/>
@@ -29687,7 +31877,7 @@
         </w:rPr>
         <w:t xml:space="preserve">BAMF – Integrationskurszahlen 2025: </w:t>
       </w:r>
-      <w:hyperlink w:history="1" r:id="rIdfqplthntaz7rc6m7geaql">
+      <w:hyperlink w:history="1" r:id="rId-iuqewk-qlgnyoaxid1hr">
         <w:r>
           <w:rPr>
             <w:rFonts w:ascii="Calibri" w:cs="Calibri" w:eastAsia="Calibri" w:hAnsi="Calibri"/>
@@ -29717,7 +31907,7 @@
         </w:rPr>
         <w:t xml:space="preserve">bpb – Schüler:innen mit anderer Familiensprache: </w:t>
       </w:r>
-      <w:hyperlink w:history="1" r:id="rIdgnxazdnmkns1umhl1oskz">
+      <w:hyperlink w:history="1" r:id="rIddpkzksnksrqiroynz6_2a">
         <w:r>
           <w:rPr>
             <w:rFonts w:ascii="Calibri" w:cs="Calibri" w:eastAsia="Calibri" w:hAnsi="Calibri"/>
@@ -29747,7 +31937,7 @@
         </w:rPr>
         <w:t xml:space="preserve">Destatis – Einwanderungsgeschichte 2025: </w:t>
       </w:r>
-      <w:hyperlink w:history="1" r:id="rId-lxih3gmozfm7lr9og9i7">
+      <w:hyperlink w:history="1" r:id="rIdvduinf0ilksfh_gv_npgf">
         <w:r>
           <w:rPr>
             <w:rFonts w:ascii="Calibri" w:cs="Calibri" w:eastAsia="Calibri" w:hAnsi="Calibri"/>
@@ -29777,7 +31967,7 @@
         </w:rPr>
         <w:t xml:space="preserve">Deutsches Schulportal – IGLU-Lesekompetenz: </w:t>
       </w:r>
-      <w:hyperlink w:history="1" r:id="rIdosgahs5x5bg3yb8uzhs7n">
+      <w:hyperlink w:history="1" r:id="rIdyp1wylefcfjirxm6ugzqe">
         <w:r>
           <w:rPr>
             <w:rFonts w:ascii="Calibri" w:cs="Calibri" w:eastAsia="Calibri" w:hAnsi="Calibri"/>
@@ -29807,7 +31997,7 @@
         </w:rPr>
         <w:t xml:space="preserve">Deutsches Schulportal – DigitalPakt 2.0: </w:t>
       </w:r>
-      <w:hyperlink w:history="1" r:id="rId8h3taes_1fufuyprbgn2x">
+      <w:hyperlink w:history="1" r:id="rIdtio4hfnqszr0lqkwfjmep">
         <w:r>
           <w:rPr>
             <w:rFonts w:ascii="Calibri" w:cs="Calibri" w:eastAsia="Calibri" w:hAnsi="Calibri"/>
@@ -29837,7 +32027,7 @@
         </w:rPr>
         <w:t xml:space="preserve">ANTON – Schullizenz-Bestellunterlagen: </w:t>
       </w:r>
-      <w:hyperlink w:history="1" r:id="rIdsmvdtodi2tq9lyer0rzfe">
+      <w:hyperlink w:history="1" r:id="rIdvdqhmxcjiehafsefmcjwh">
         <w:r>
           <w:rPr>
             <w:rFonts w:ascii="Calibri" w:cs="Calibri" w:eastAsia="Calibri" w:hAnsi="Calibri"/>
@@ -29867,7 +32057,7 @@
         </w:rPr>
         <w:t xml:space="preserve">Microsoft – Reading Coach: </w:t>
       </w:r>
-      <w:hyperlink w:history="1" r:id="rId4-eku3-ea5mjmojbsgwf-">
+      <w:hyperlink w:history="1" r:id="rIdhbco15qafb99pm5wywyl-">
         <w:r>
           <w:rPr>
             <w:rFonts w:ascii="Calibri" w:cs="Calibri" w:eastAsia="Calibri" w:hAnsi="Calibri"/>
@@ -29897,7 +32087,7 @@
         </w:rPr>
         <w:t xml:space="preserve">Google – Read Along: </w:t>
       </w:r>
-      <w:hyperlink w:history="1" r:id="rIdvfaimcxilqurienzi3ay5">
+      <w:hyperlink w:history="1" r:id="rIdt3xwpwb9jeurtoaryye5o">
         <w:r>
           <w:rPr>
             <w:rFonts w:ascii="Calibri" w:cs="Calibri" w:eastAsia="Calibri" w:hAnsi="Calibri"/>
@@ -29927,7 +32117,7 @@
         </w:rPr>
         <w:t xml:space="preserve">Piper TTS: </w:t>
       </w:r>
-      <w:hyperlink w:history="1" r:id="rIdk59k18czs-dhqul0gomxu">
+      <w:hyperlink w:history="1" r:id="rIdnhf0vtrnvqeq4zyf-dbru">
         <w:r>
           <w:rPr>
             <w:rFonts w:ascii="Calibri" w:cs="Calibri" w:eastAsia="Calibri" w:hAnsi="Calibri"/>
@@ -29957,7 +32147,7 @@
         </w:rPr>
         <w:t xml:space="preserve">IDC – Smart Glasses 2026: </w:t>
       </w:r>
-      <w:hyperlink w:history="1" r:id="rId_gpzemakvcthawh5ctf52">
+      <w:hyperlink w:history="1" r:id="rIdyncw2jyglp5s75uc9ahnc">
         <w:r>
           <w:rPr>
             <w:rFonts w:ascii="Calibri" w:cs="Calibri" w:eastAsia="Calibri" w:hAnsi="Calibri"/>
@@ -29987,7 +32177,7 @@
         </w:rPr>
         <w:t xml:space="preserve">gHacks – Meta Ray-Ban Display für Web-Apps geöffnet: </w:t>
       </w:r>
-      <w:hyperlink w:history="1" r:id="rIdajdc3yzwtyttbqx1mlb1a">
+      <w:hyperlink w:history="1" r:id="rIdsgvua3yrohkzryljovuhc">
         <w:r>
           <w:rPr>
             <w:rFonts w:ascii="Calibri" w:cs="Calibri" w:eastAsia="Calibri" w:hAnsi="Calibri"/>
@@ -30017,7 +32207,7 @@
         </w:rPr>
         <w:t xml:space="preserve">W3C Immersive Web – WebXR DOM Overlays: </w:t>
       </w:r>
-      <w:hyperlink w:history="1" r:id="rIdzynsv1njjlcvvmftwb9hz">
+      <w:hyperlink w:history="1" r:id="rIdrmehejtgk7bi2txcrvmta">
         <w:r>
           <w:rPr>
             <w:rFonts w:ascii="Calibri" w:cs="Calibri" w:eastAsia="Calibri" w:hAnsi="Calibri"/>
@@ -30047,7 +32237,7 @@
         </w:rPr>
         <w:t xml:space="preserve">MDN – WebXR Device API: </w:t>
       </w:r>
-      <w:hyperlink w:history="1" r:id="rIdyiczciw61s5lv85pi4vfo">
+      <w:hyperlink w:history="1" r:id="rId63iviilxxusa3xuihijh6">
         <w:r>
           <w:rPr>
             <w:rFonts w:ascii="Calibri" w:cs="Calibri" w:eastAsia="Calibri" w:hAnsi="Calibri"/>
@@ -30077,7 +32267,7 @@
         </w:rPr>
         <w:t xml:space="preserve">Resolume – Avenue/Arena Preise: </w:t>
       </w:r>
-      <w:hyperlink w:history="1" r:id="rIdm6etb6x7vnzmzezvu1hbe">
+      <w:hyperlink w:history="1" r:id="rIdmcgvbhok0ai5svt59hlfd">
         <w:r>
           <w:rPr>
             <w:rFonts w:ascii="Calibri" w:cs="Calibri" w:eastAsia="Calibri" w:hAnsi="Calibri"/>
@@ -30107,7 +32297,7 @@
         </w:rPr>
         <w:t xml:space="preserve">Musikwoche – tonies Umsatz 2025: </w:t>
       </w:r>
-      <w:hyperlink w:history="1" r:id="rIdtqmj8ikdm7l_siv7ivxzv">
+      <w:hyperlink w:history="1" r:id="rIdxktwvm8khtxmv1irhbjcs">
         <w:r>
           <w:rPr>
             <w:rFonts w:ascii="Calibri" w:cs="Calibri" w:eastAsia="Calibri" w:hAnsi="Calibri"/>
@@ -30137,7 +32327,7 @@
         </w:rPr>
         <w:t xml:space="preserve">The Business Research Company – Video Editing Software: </w:t>
       </w:r>
-      <w:hyperlink w:history="1" r:id="rIdesyoofqjryloek5f-ynjy">
+      <w:hyperlink w:history="1" r:id="rIdedxo2q7oeltna8pibp_pj">
         <w:r>
           <w:rPr>
             <w:rFonts w:ascii="Calibri" w:cs="Calibri" w:eastAsia="Calibri" w:hAnsi="Calibri"/>
@@ -30167,7 +32357,7 @@
         </w:rPr>
         <w:t xml:space="preserve">Expanded Ramblings – CapCut-Statistiken (Sensor Tower): </w:t>
       </w:r>
-      <w:hyperlink w:history="1" r:id="rIdwf4u_dimzqhknccmfvqgd">
+      <w:hyperlink w:history="1" r:id="rIdmuwcpnlaoh_gze8rxbz4p">
         <w:r>
           <w:rPr>
             <w:rFonts w:ascii="Calibri" w:cs="Calibri" w:eastAsia="Calibri" w:hAnsi="Calibri"/>
@@ -30197,7 +32387,7 @@
         </w:rPr>
         <w:t xml:space="preserve">Sacra – OpusClip: </w:t>
       </w:r>
-      <w:hyperlink w:history="1" r:id="rId4d_grtry-zgf4i8nm0_cx">
+      <w:hyperlink w:history="1" r:id="rIdsmtf1shw3xcypqjy6hvoh">
         <w:r>
           <w:rPr>
             <w:rFonts w:ascii="Calibri" w:cs="Calibri" w:eastAsia="Calibri" w:hAnsi="Calibri"/>
@@ -30227,7 +32417,7 @@
         </w:rPr>
         <w:t xml:space="preserve">ngram – OpusClip vs. Submagic (Preise): </w:t>
       </w:r>
-      <w:hyperlink w:history="1" r:id="rIdayktr4kv3-c-jfsrywbyw">
+      <w:hyperlink w:history="1" r:id="rIdesnzevgrlsu4grea2itin">
         <w:r>
           <w:rPr>
             <w:rFonts w:ascii="Calibri" w:cs="Calibri" w:eastAsia="Calibri" w:hAnsi="Calibri"/>
@@ -30257,7 +32447,7 @@
         </w:rPr>
         <w:t xml:space="preserve">Castmagic – Descript Pricing: </w:t>
       </w:r>
-      <w:hyperlink w:history="1" r:id="rIdcvimjfpo1u3m_n-fflydp">
+      <w:hyperlink w:history="1" r:id="rIdhwmobalaobv_z8lkc_cmb">
         <w:r>
           <w:rPr>
             <w:rFonts w:ascii="Calibri" w:cs="Calibri" w:eastAsia="Calibri" w:hAnsi="Calibri"/>
@@ -30287,7 +32477,7 @@
         </w:rPr>
         <w:t xml:space="preserve">CNBC – Canva kauft Cavalry und MangoAI: </w:t>
       </w:r>
-      <w:hyperlink w:history="1" r:id="rIdiwl_b9ccabjs5ox8bd-oc">
+      <w:hyperlink w:history="1" r:id="rIdrsf2zrz1elfyyphph2toq">
         <w:r>
           <w:rPr>
             <w:rFonts w:ascii="Calibri" w:cs="Calibri" w:eastAsia="Calibri" w:hAnsi="Calibri"/>
@@ -30317,7 +32507,7 @@
         </w:rPr>
         <w:t xml:space="preserve">caniuse – WebCodecs: </w:t>
       </w:r>
-      <w:hyperlink w:history="1" r:id="rIdxi8ee3arejguwf-gtcdb4">
+      <w:hyperlink w:history="1" r:id="rId18fv7uldmj6cggpnejfy9">
         <w:r>
           <w:rPr>
             <w:rFonts w:ascii="Calibri" w:cs="Calibri" w:eastAsia="Calibri" w:hAnsi="Calibri"/>
@@ -30347,7 +32537,7 @@
         </w:rPr>
         <w:t xml:space="preserve">WebKit – Features in Safari 26.0 (AudioEncoder): </w:t>
       </w:r>
-      <w:hyperlink w:history="1" r:id="rIdpe5oqtqq2fvs5pcwaylo4">
+      <w:hyperlink w:history="1" r:id="rIdtezlbdgge0xdgyr3eluas">
         <w:r>
           <w:rPr>
             <w:rFonts w:ascii="Calibri" w:cs="Calibri" w:eastAsia="Calibri" w:hAnsi="Calibri"/>
@@ -30377,7 +32567,7 @@
         </w:rPr>
         <w:t xml:space="preserve">Mediabunny: </w:t>
       </w:r>
-      <w:hyperlink w:history="1" r:id="rIdtixtzi8sxzqx_f50msmek">
+      <w:hyperlink w:history="1" r:id="rIdwirrbmhp8_puoinkqceuj">
         <w:r>
           <w:rPr>
             <w:rFonts w:ascii="Calibri" w:cs="Calibri" w:eastAsia="Calibri" w:hAnsi="Calibri"/>
@@ -30407,7 +32597,7 @@
         </w:rPr>
         <w:t xml:space="preserve">Xenova – whisper-web (WebGPU): </w:t>
       </w:r>
-      <w:hyperlink w:history="1" r:id="rIdlkdlliubi-rngfdbfrbxs">
+      <w:hyperlink w:history="1" r:id="rId_utoxhvg5l1swecpujpit">
         <w:r>
           <w:rPr>
             <w:rFonts w:ascii="Calibri" w:cs="Calibri" w:eastAsia="Calibri" w:hAnsi="Calibri"/>

</xml_diff>